<commit_message>
feat(ue144): regolamento definitivo — calendario, Mercedes-AMG GT3, blue flag, proteste
</commit_message>
<xml_diff>
--- a/docs/ue144/ue144_regolamento.docx
+++ b/docs/ue144/ue144_regolamento.docx
@@ -249,7 +249,7 @@
           <w:sz w:val="20"/>
           <w:szCs w:val="20"/>
         </w:rPr>
-        <w:t xml:space="preserve">Il VSD Ultimate Endurance 144' (di seguito "UE144") è il campionato endurance ufficiale di Virtual Speed Driver (VSD). La serie si disputa interamente su Le Mans Ultimate (LMU) e si sviluppa in 4-6 round stagionali, ciascuno della durata di 144 minuti.</w:t>
+        <w:t xml:space="preserve">Il VSD Ultimate Endurance 144' (di seguito "UE144") è il campionato endurance ufficiale di Virtual Sim-Driver (VSD). La serie si disputa interamente su Le Mans Ultimate (LMU) e si sviluppa in round stagionali, ciascuno della durata in-game di 144 minuti.</w:t>
       </w:r>
     </w:p>
     <w:p>
@@ -270,28 +270,7 @@
           <w:sz w:val="20"/>
           <w:szCs w:val="20"/>
         </w:rPr>
-        <w:t xml:space="preserve">Il format multiclasse — Hypercar, LMP2, LMGT3 — replica la struttura delle grandi gare di durata reali, con piloti singoli che competono all'interno della propria categoria.</w:t>
-      </w:r>
-    </w:p>
-    <w:p>
-      <w:pPr>
-        <w:spacing w:after="0" w:before="80"/>
-      </w:pPr>
-    </w:p>
-    <w:p>
-      <w:pPr>
-        <w:spacing w:after="80" w:before="80"/>
-      </w:pPr>
-      <w:r>
-        <w:rPr>
-          <w:rFonts w:ascii="Calibri" w:cs="Calibri" w:eastAsia="Calibri" w:hAnsi="Calibri"/>
-          <w:b w:val="false"/>
-          <w:bCs w:val="false"/>
-          <w:color w:val="1A1A2E"/>
-          <w:sz w:val="20"/>
-          <w:szCs w:val="20"/>
-        </w:rPr>
-        <w:t xml:space="preserve">L'UE144 è aperto a tutti i piloti VSD in regola con l'iscrizione alla community. Le iscrizioni e i risultati sono gestiti tramite VSD Paddock (vsd-paddock.vercel.app).</w:t>
+        <w:t xml:space="preserve">Il format multiclasse replica la struttura delle grandi gare di durata reali, con piloti singoli che competono all'interno della propria categoria. L'UE144 è aperto a tutti i piloti VSD in regola con l'iscrizione alla community. Le iscrizioni e i risultati sono gestiti tramite la nostra piattaforma ufficiale.</w:t>
       </w:r>
     </w:p>
     <w:p>
@@ -362,7 +341,7 @@
           <w:sz w:val="20"/>
           <w:szCs w:val="20"/>
         </w:rPr>
-        <w:t xml:space="preserve">Practice: 30 minuti — sessione aperta (open lobby), per prendere confidenza con il setup</w:t>
+        <w:t xml:space="preserve">Practice: 30 minuti — sessione aperta (open lobby), dedicata all'analisi telemetrica e al setup</w:t>
       </w:r>
     </w:p>
     <w:p>
@@ -388,7 +367,7 @@
           <w:sz w:val="20"/>
           <w:szCs w:val="20"/>
         </w:rPr>
-        <w:t xml:space="preserve">Qualifiche: 15 minuti — sessione privata (private mode), griglia di partenza per classe</w:t>
+        <w:t xml:space="preserve">Qualifiche: 15 minuti — sessione privata (solo pilota in pista per il time attack puro). Griglia di partenza divisa per classe</w:t>
       </w:r>
     </w:p>
     <w:p>
@@ -440,7 +419,7 @@
           <w:sz w:val="20"/>
           <w:szCs w:val="20"/>
         </w:rPr>
-        <w:t xml:space="preserve">Pit stop: non obbligatori, a discrezione del pilota</w:t>
+        <w:t xml:space="preserve">Pit stop: non obbligatori — le strategie di fuel saving e gestione pneumatici (incluso il double stint) sono a totale discrezione del pilota</w:t>
       </w:r>
     </w:p>
     <w:p>
@@ -817,7 +796,7 @@
                 <w:sz w:val="17"/>
                 <w:szCs w:val="17"/>
               </w:rPr>
-              <w:t xml:space="preserve">Ferrari 296 GT3, Porsche 911 GT3 R, Corvette Z06 GT3.R, Ford Mustang GT3, BMW M4 GT3, McLaren 720S GT3 Evo, Aston Martin Vantage GT3</w:t>
+              <w:t xml:space="preserve">Ferrari 296 GT3, Porsche 911 GT3 R, Corvette Z06 GT3.R, Ford Mustang GT3, BMW M4 GT3, McLaren 720S GT3 Evo, Aston Martin Vantage GT3, Mercedes-AMG GT3</w:t>
             </w:r>
           </w:p>
         </w:tc>
@@ -1892,7 +1871,7 @@
           <w:sz w:val="22"/>
           <w:szCs w:val="22"/>
         </w:rPr>
-        <w:t xml:space="preserve">5.3 Blue Flag (precedenza tra classi)</w:t>
+        <w:t xml:space="preserve">5.3 Blue Flag e Precedenza — Codice Endurance VSD</w:t>
       </w:r>
     </w:p>
     <w:p>
@@ -1908,7 +1887,7 @@
           <w:sz w:val="20"/>
           <w:szCs w:val="20"/>
         </w:rPr>
-        <w:t xml:space="preserve">Le vetture di classe inferiore devono cedere il passo alla prima occasione sicura. Gerarchia:</w:t>
+        <w:t xml:space="preserve">Le categorie più lente hanno l'assoluta precedenza di traiettoria. Le auto di classe superiore (Hypercar e LMP2) hanno l'onere esclusivo di effettuare i sorpassi senza creare situazioni di rischio.</w:t>
       </w:r>
     </w:p>
     <w:p>
@@ -1934,7 +1913,7 @@
           <w:sz w:val="20"/>
           <w:szCs w:val="20"/>
         </w:rPr>
-        <w:t xml:space="preserve">LMP2 cede il passo agli Hypercar</w:t>
+        <w:t xml:space="preserve">Le LMGT3 e LMP2 in fase di doppiaggio devono mantenere una linea prevedibile</w:t>
       </w:r>
     </w:p>
     <w:p>
@@ -1960,7 +1939,33 @@
           <w:sz w:val="20"/>
           <w:szCs w:val="20"/>
         </w:rPr>
-        <w:t xml:space="preserve">LMGT3 cede il passo a Hypercar e LMP2</w:t>
+        <w:t xml:space="preserve">I piloti delle classi più veloci devono preparare l'attacco e sorpassare nei rettilinei o nelle zone sicure</w:t>
+      </w:r>
+    </w:p>
+    <w:p>
+      <w:pPr>
+        <w:spacing w:after="60" w:before="60"/>
+        <w:ind w:left="504"/>
+      </w:pPr>
+      <w:r>
+        <w:rPr>
+          <w:rFonts w:ascii="Calibri" w:cs="Calibri" w:eastAsia="Calibri" w:hAnsi="Calibri"/>
+          <w:b/>
+          <w:bCs/>
+          <w:color w:val="00D9FF"/>
+          <w:sz w:val="20"/>
+          <w:szCs w:val="20"/>
+        </w:rPr>
+        <w:t xml:space="preserve">▸  </w:t>
+      </w:r>
+      <w:r>
+        <w:rPr>
+          <w:rFonts w:ascii="Calibri" w:cs="Calibri" w:eastAsia="Calibri" w:hAnsi="Calibri"/>
+          <w:color w:val="1A1A2E"/>
+          <w:sz w:val="20"/>
+          <w:szCs w:val="20"/>
+        </w:rPr>
+        <w:t xml:space="preserve">Vietate manovre di dive bomb che compromettano l'aerodinamica avversaria</w:t>
       </w:r>
     </w:p>
     <w:p>
@@ -3752,7 +3757,7 @@
           <w:sz w:val="26"/>
           <w:szCs w:val="26"/>
         </w:rPr>
-        <w:t xml:space="preserve">8. CALENDARIO</w:t>
+        <w:t xml:space="preserve">8. CALENDARIO UFFICIALE</w:t>
       </w:r>
     </w:p>
     <w:p>
@@ -3768,7 +3773,7 @@
           <w:sz w:val="20"/>
           <w:szCs w:val="20"/>
         </w:rPr>
-        <w:t xml:space="preserve">Il calendario verrà pubblicato su VSD Paddock almeno 2 settimane prima del primo round.</w:t>
+        <w:t xml:space="preserve">Start: Settembre 2026. Il campionato richiederà massima flessibilità sui setup per adattarsi all'evoluzione termica del Real Road.</w:t>
       </w:r>
     </w:p>
     <w:p>
@@ -3789,11 +3794,11 @@
         </w:tblBorders>
       </w:tblPr>
       <w:tblGrid>
+        <w:gridCol w:w="720"/>
+        <w:gridCol w:w="2600"/>
+        <w:gridCol w:w="1600"/>
         <w:gridCol w:w="900"/>
-        <w:gridCol w:w="2800"/>
-        <w:gridCol w:w="2200"/>
-        <w:gridCol w:w="1586"/>
-        <w:gridCol w:w="1586"/>
+        <w:gridCol w:w="2252"/>
       </w:tblGrid>
       <w:tr>
         <w:trPr>
@@ -3801,7 +3806,7 @@
         </w:trPr>
         <w:tc>
           <w:tcPr>
-            <w:tcW w:type="dxa" w:w="900"/>
+            <w:tcW w:type="dxa" w:w="720"/>
             <w:shd w:fill="0A0E1A" w:val="clear"/>
             <w:tcMar>
               <w:top w:type="dxa" w:w="80"/>
@@ -3830,7 +3835,7 @@
         </w:tc>
         <w:tc>
           <w:tcPr>
-            <w:tcW w:type="dxa" w:w="2800"/>
+            <w:tcW w:type="dxa" w:w="2600"/>
             <w:shd w:fill="0A0E1A" w:val="clear"/>
             <w:tcMar>
               <w:top w:type="dxa" w:w="80"/>
@@ -3859,7 +3864,7 @@
         </w:tc>
         <w:tc>
           <w:tcPr>
-            <w:tcW w:type="dxa" w:w="2200"/>
+            <w:tcW w:type="dxa" w:w="1600"/>
             <w:shd w:fill="0A0E1A" w:val="clear"/>
             <w:tcMar>
               <w:top w:type="dxa" w:w="80"/>
@@ -3888,7 +3893,7 @@
         </w:tc>
         <w:tc>
           <w:tcPr>
-            <w:tcW w:type="dxa" w:w="1586"/>
+            <w:tcW w:type="dxa" w:w="900"/>
             <w:shd w:fill="0A0E1A" w:val="clear"/>
             <w:tcMar>
               <w:top w:type="dxa" w:w="80"/>
@@ -3911,13 +3916,13 @@
                 <w:sz w:val="18"/>
                 <w:szCs w:val="18"/>
               </w:rPr>
-              <w:t xml:space="preserve">Orario</w:t>
-            </w:r>
-          </w:p>
-        </w:tc>
-        <w:tc>
-          <w:tcPr>
-            <w:tcW w:type="dxa" w:w="1586"/>
+              <w:t xml:space="preserve">Ora</w:t>
+            </w:r>
+          </w:p>
+        </w:tc>
+        <w:tc>
+          <w:tcPr>
+            <w:tcW w:type="dxa" w:w="2252"/>
             <w:shd w:fill="0A0E1A" w:val="clear"/>
             <w:tcMar>
               <w:top w:type="dxa" w:w="80"/>
@@ -3929,7 +3934,7 @@
           </w:tcPr>
           <w:p>
             <w:pPr>
-              <w:jc w:val="center"/>
+              <w:jc w:val="left"/>
             </w:pPr>
             <w:r>
               <w:rPr>
@@ -3940,7 +3945,7 @@
                 <w:sz w:val="18"/>
                 <w:szCs w:val="18"/>
               </w:rPr>
-              <w:t xml:space="preserve">Meteo</w:t>
+              <w:t xml:space="preserve">Meteo &amp; Moltiplicatore</w:t>
             </w:r>
           </w:p>
         </w:tc>
@@ -3948,7 +3953,8 @@
       <w:tr>
         <w:tc>
           <w:tcPr>
-            <w:tcW w:type="dxa" w:w="900"/>
+            <w:tcW w:type="dxa" w:w="720"/>
+            <w:shd w:fill="E8E8E8" w:val="clear"/>
             <w:tcMar>
               <w:top w:type="dxa" w:w="80"/>
               <w:left w:type="dxa" w:w="120"/>
@@ -3966,7 +3972,7 @@
                 <w:rFonts w:ascii="Calibri" w:cs="Calibri" w:eastAsia="Calibri" w:hAnsi="Calibri"/>
                 <w:b/>
                 <w:bCs/>
-                <w:color w:val="1A1A2E"/>
+                <w:color w:val="006666"/>
                 <w:sz w:val="18"/>
                 <w:szCs w:val="18"/>
               </w:rPr>
@@ -3976,7 +3982,8 @@
         </w:tc>
         <w:tc>
           <w:tcPr>
-            <w:tcW w:type="dxa" w:w="2800"/>
+            <w:tcW w:type="dxa" w:w="2600"/>
+            <w:shd w:fill="E8E8E8" w:val="clear"/>
             <w:tcMar>
               <w:top w:type="dxa" w:w="80"/>
               <w:left w:type="dxa" w:w="120"/>
@@ -3994,17 +4001,18 @@
                 <w:rFonts w:ascii="Calibri" w:cs="Calibri" w:eastAsia="Calibri" w:hAnsi="Calibri"/>
                 <w:b w:val="false"/>
                 <w:bCs w:val="false"/>
-                <w:color w:val="555555"/>
+                <w:color w:val="1A1A2E"/>
                 <w:sz w:val="17"/>
                 <w:szCs w:val="17"/>
               </w:rPr>
-              <w:t xml:space="preserve">TBD</w:t>
-            </w:r>
-          </w:p>
-        </w:tc>
-        <w:tc>
-          <w:tcPr>
-            <w:tcW w:type="dxa" w:w="2200"/>
+              <w:t xml:space="preserve">Sebring International Raceway</w:t>
+            </w:r>
+          </w:p>
+        </w:tc>
+        <w:tc>
+          <w:tcPr>
+            <w:tcW w:type="dxa" w:w="1600"/>
+            <w:shd w:fill="E8E8E8" w:val="clear"/>
             <w:tcMar>
               <w:top w:type="dxa" w:w="80"/>
               <w:left w:type="dxa" w:w="120"/>
@@ -4022,17 +4030,18 @@
                 <w:rFonts w:ascii="Calibri" w:cs="Calibri" w:eastAsia="Calibri" w:hAnsi="Calibri"/>
                 <w:b w:val="false"/>
                 <w:bCs w:val="false"/>
-                <w:color w:val="555555"/>
+                <w:color w:val="1A1A2E"/>
                 <w:sz w:val="17"/>
                 <w:szCs w:val="17"/>
               </w:rPr>
-              <w:t xml:space="preserve">TBD</w:t>
-            </w:r>
-          </w:p>
-        </w:tc>
-        <w:tc>
-          <w:tcPr>
-            <w:tcW w:type="dxa" w:w="1586"/>
+              <w:t xml:space="preserve">13 Set 2026</w:t>
+            </w:r>
+          </w:p>
+        </w:tc>
+        <w:tc>
+          <w:tcPr>
+            <w:tcW w:type="dxa" w:w="900"/>
+            <w:shd w:fill="E8E8E8" w:val="clear"/>
             <w:tcMar>
               <w:top w:type="dxa" w:w="80"/>
               <w:left w:type="dxa" w:w="120"/>
@@ -4050,17 +4059,49 @@
                 <w:rFonts w:ascii="Calibri" w:cs="Calibri" w:eastAsia="Calibri" w:hAnsi="Calibri"/>
                 <w:b w:val="false"/>
                 <w:bCs w:val="false"/>
-                <w:color w:val="555555"/>
+                <w:color w:val="1A1A2E"/>
                 <w:sz w:val="17"/>
                 <w:szCs w:val="17"/>
               </w:rPr>
-              <w:t xml:space="preserve">TBD</w:t>
-            </w:r>
-          </w:p>
-        </w:tc>
-        <w:tc>
-          <w:tcPr>
-            <w:tcW w:type="dxa" w:w="1586"/>
+              <w:t xml:space="preserve">14:00</w:t>
+            </w:r>
+          </w:p>
+        </w:tc>
+        <w:tc>
+          <w:tcPr>
+            <w:tcW w:type="dxa" w:w="2252"/>
+            <w:shd w:fill="E8E8E8" w:val="clear"/>
+            <w:tcMar>
+              <w:top w:type="dxa" w:w="80"/>
+              <w:left w:type="dxa" w:w="120"/>
+              <w:bottom w:type="dxa" w:w="80"/>
+              <w:right w:type="dxa" w:w="120"/>
+            </w:tcMar>
+            <w:vAlign w:val="center"/>
+          </w:tcPr>
+          <w:p>
+            <w:pPr>
+              <w:jc w:val="left"/>
+            </w:pPr>
+            <w:r>
+              <w:rPr>
+                <w:rFonts w:ascii="Calibri" w:cs="Calibri" w:eastAsia="Calibri" w:hAnsi="Calibri"/>
+                <w:b w:val="false"/>
+                <w:bCs w:val="false"/>
+                <w:color w:val="555555"/>
+                <w:sz w:val="16"/>
+                <w:szCs w:val="16"/>
+              </w:rPr>
+              <w:t xml:space="preserve">Sereno → Notte serena (5×)</w:t>
+            </w:r>
+          </w:p>
+        </w:tc>
+      </w:tr>
+      <w:tr>
+        <w:tc>
+          <w:tcPr>
+            <w:tcW w:type="dxa" w:w="720"/>
+            <w:shd w:fill="FFFFFF" w:val="clear"/>
             <w:tcMar>
               <w:top w:type="dxa" w:w="80"/>
               <w:left w:type="dxa" w:w="120"/>
@@ -4076,13 +4117,129 @@
             <w:r>
               <w:rPr>
                 <w:rFonts w:ascii="Calibri" w:cs="Calibri" w:eastAsia="Calibri" w:hAnsi="Calibri"/>
-                <w:b w:val="false"/>
-                <w:bCs w:val="false"/>
-                <w:color w:val="555555"/>
+                <w:b/>
+                <w:bCs/>
+                <w:color w:val="006666"/>
+                <w:sz w:val="18"/>
+                <w:szCs w:val="18"/>
+              </w:rPr>
+              <w:t xml:space="preserve">R2</w:t>
+            </w:r>
+          </w:p>
+        </w:tc>
+        <w:tc>
+          <w:tcPr>
+            <w:tcW w:type="dxa" w:w="2600"/>
+            <w:shd w:fill="FFFFFF" w:val="clear"/>
+            <w:tcMar>
+              <w:top w:type="dxa" w:w="80"/>
+              <w:left w:type="dxa" w:w="120"/>
+              <w:bottom w:type="dxa" w:w="80"/>
+              <w:right w:type="dxa" w:w="120"/>
+            </w:tcMar>
+            <w:vAlign w:val="center"/>
+          </w:tcPr>
+          <w:p>
+            <w:pPr>
+              <w:jc w:val="left"/>
+            </w:pPr>
+            <w:r>
+              <w:rPr>
+                <w:rFonts w:ascii="Calibri" w:cs="Calibri" w:eastAsia="Calibri" w:hAnsi="Calibri"/>
+                <w:b w:val="false"/>
+                <w:bCs w:val="false"/>
+                <w:color w:val="1A1A2E"/>
                 <w:sz w:val="17"/>
                 <w:szCs w:val="17"/>
               </w:rPr>
-              <w:t xml:space="preserve">TBD</w:t>
+              <w:t xml:space="preserve">Autodromo Enzo e Dino Ferrari (Imola)</w:t>
+            </w:r>
+          </w:p>
+        </w:tc>
+        <w:tc>
+          <w:tcPr>
+            <w:tcW w:type="dxa" w:w="1600"/>
+            <w:shd w:fill="FFFFFF" w:val="clear"/>
+            <w:tcMar>
+              <w:top w:type="dxa" w:w="80"/>
+              <w:left w:type="dxa" w:w="120"/>
+              <w:bottom w:type="dxa" w:w="80"/>
+              <w:right w:type="dxa" w:w="120"/>
+            </w:tcMar>
+            <w:vAlign w:val="center"/>
+          </w:tcPr>
+          <w:p>
+            <w:pPr>
+              <w:jc w:val="center"/>
+            </w:pPr>
+            <w:r>
+              <w:rPr>
+                <w:rFonts w:ascii="Calibri" w:cs="Calibri" w:eastAsia="Calibri" w:hAnsi="Calibri"/>
+                <w:b w:val="false"/>
+                <w:bCs w:val="false"/>
+                <w:color w:val="1A1A2E"/>
+                <w:sz w:val="17"/>
+                <w:szCs w:val="17"/>
+              </w:rPr>
+              <w:t xml:space="preserve">27 Set 2026</w:t>
+            </w:r>
+          </w:p>
+        </w:tc>
+        <w:tc>
+          <w:tcPr>
+            <w:tcW w:type="dxa" w:w="900"/>
+            <w:shd w:fill="FFFFFF" w:val="clear"/>
+            <w:tcMar>
+              <w:top w:type="dxa" w:w="80"/>
+              <w:left w:type="dxa" w:w="120"/>
+              <w:bottom w:type="dxa" w:w="80"/>
+              <w:right w:type="dxa" w:w="120"/>
+            </w:tcMar>
+            <w:vAlign w:val="center"/>
+          </w:tcPr>
+          <w:p>
+            <w:pPr>
+              <w:jc w:val="center"/>
+            </w:pPr>
+            <w:r>
+              <w:rPr>
+                <w:rFonts w:ascii="Calibri" w:cs="Calibri" w:eastAsia="Calibri" w:hAnsi="Calibri"/>
+                <w:b w:val="false"/>
+                <w:bCs w:val="false"/>
+                <w:color w:val="1A1A2E"/>
+                <w:sz w:val="17"/>
+                <w:szCs w:val="17"/>
+              </w:rPr>
+              <w:t xml:space="preserve">10:00</w:t>
+            </w:r>
+          </w:p>
+        </w:tc>
+        <w:tc>
+          <w:tcPr>
+            <w:tcW w:type="dxa" w:w="2252"/>
+            <w:shd w:fill="FFFFFF" w:val="clear"/>
+            <w:tcMar>
+              <w:top w:type="dxa" w:w="80"/>
+              <w:left w:type="dxa" w:w="120"/>
+              <w:bottom w:type="dxa" w:w="80"/>
+              <w:right w:type="dxa" w:w="120"/>
+            </w:tcMar>
+            <w:vAlign w:val="center"/>
+          </w:tcPr>
+          <w:p>
+            <w:pPr>
+              <w:jc w:val="left"/>
+            </w:pPr>
+            <w:r>
+              <w:rPr>
+                <w:rFonts w:ascii="Calibri" w:cs="Calibri" w:eastAsia="Calibri" w:hAnsi="Calibri"/>
+                <w:b w:val="false"/>
+                <w:bCs w:val="false"/>
+                <w:color w:val="555555"/>
+                <w:sz w:val="16"/>
+                <w:szCs w:val="16"/>
+              </w:rPr>
+              <w:t xml:space="preserve">Nuvoloso → Sereno (2×)</w:t>
             </w:r>
           </w:p>
         </w:tc>
@@ -4090,7 +4247,8 @@
       <w:tr>
         <w:tc>
           <w:tcPr>
-            <w:tcW w:type="dxa" w:w="900"/>
+            <w:tcW w:type="dxa" w:w="720"/>
+            <w:shd w:fill="E8E8E8" w:val="clear"/>
             <w:tcMar>
               <w:top w:type="dxa" w:w="80"/>
               <w:left w:type="dxa" w:w="120"/>
@@ -4108,17 +4266,18 @@
                 <w:rFonts w:ascii="Calibri" w:cs="Calibri" w:eastAsia="Calibri" w:hAnsi="Calibri"/>
                 <w:b/>
                 <w:bCs/>
-                <w:color w:val="1A1A2E"/>
+                <w:color w:val="006666"/>
                 <w:sz w:val="18"/>
                 <w:szCs w:val="18"/>
               </w:rPr>
-              <w:t xml:space="preserve">R2</w:t>
-            </w:r>
-          </w:p>
-        </w:tc>
-        <w:tc>
-          <w:tcPr>
-            <w:tcW w:type="dxa" w:w="2800"/>
+              <w:t xml:space="preserve">R3</w:t>
+            </w:r>
+          </w:p>
+        </w:tc>
+        <w:tc>
+          <w:tcPr>
+            <w:tcW w:type="dxa" w:w="2600"/>
+            <w:shd w:fill="E8E8E8" w:val="clear"/>
             <w:tcMar>
               <w:top w:type="dxa" w:w="80"/>
               <w:left w:type="dxa" w:w="120"/>
@@ -4136,17 +4295,18 @@
                 <w:rFonts w:ascii="Calibri" w:cs="Calibri" w:eastAsia="Calibri" w:hAnsi="Calibri"/>
                 <w:b w:val="false"/>
                 <w:bCs w:val="false"/>
-                <w:color w:val="555555"/>
+                <w:color w:val="1A1A2E"/>
                 <w:sz w:val="17"/>
                 <w:szCs w:val="17"/>
               </w:rPr>
-              <w:t xml:space="preserve">TBD</w:t>
-            </w:r>
-          </w:p>
-        </w:tc>
-        <w:tc>
-          <w:tcPr>
-            <w:tcW w:type="dxa" w:w="2200"/>
+              <w:t xml:space="preserve">Circuit de Spa-Francorchamps</w:t>
+            </w:r>
+          </w:p>
+        </w:tc>
+        <w:tc>
+          <w:tcPr>
+            <w:tcW w:type="dxa" w:w="1600"/>
+            <w:shd w:fill="E8E8E8" w:val="clear"/>
             <w:tcMar>
               <w:top w:type="dxa" w:w="80"/>
               <w:left w:type="dxa" w:w="120"/>
@@ -4164,17 +4324,18 @@
                 <w:rFonts w:ascii="Calibri" w:cs="Calibri" w:eastAsia="Calibri" w:hAnsi="Calibri"/>
                 <w:b w:val="false"/>
                 <w:bCs w:val="false"/>
-                <w:color w:val="555555"/>
+                <w:color w:val="1A1A2E"/>
                 <w:sz w:val="17"/>
                 <w:szCs w:val="17"/>
               </w:rPr>
-              <w:t xml:space="preserve">TBD</w:t>
-            </w:r>
-          </w:p>
-        </w:tc>
-        <w:tc>
-          <w:tcPr>
-            <w:tcW w:type="dxa" w:w="1586"/>
+              <w:t xml:space="preserve">11 Ott 2026</w:t>
+            </w:r>
+          </w:p>
+        </w:tc>
+        <w:tc>
+          <w:tcPr>
+            <w:tcW w:type="dxa" w:w="900"/>
+            <w:shd w:fill="E8E8E8" w:val="clear"/>
             <w:tcMar>
               <w:top w:type="dxa" w:w="80"/>
               <w:left w:type="dxa" w:w="120"/>
@@ -4192,17 +4353,49 @@
                 <w:rFonts w:ascii="Calibri" w:cs="Calibri" w:eastAsia="Calibri" w:hAnsi="Calibri"/>
                 <w:b w:val="false"/>
                 <w:bCs w:val="false"/>
-                <w:color w:val="555555"/>
+                <w:color w:val="1A1A2E"/>
                 <w:sz w:val="17"/>
                 <w:szCs w:val="17"/>
               </w:rPr>
-              <w:t xml:space="preserve">TBD</w:t>
-            </w:r>
-          </w:p>
-        </w:tc>
-        <w:tc>
-          <w:tcPr>
-            <w:tcW w:type="dxa" w:w="1586"/>
+              <w:t xml:space="preserve">15:00</w:t>
+            </w:r>
+          </w:p>
+        </w:tc>
+        <w:tc>
+          <w:tcPr>
+            <w:tcW w:type="dxa" w:w="2252"/>
+            <w:shd w:fill="E8E8E8" w:val="clear"/>
+            <w:tcMar>
+              <w:top w:type="dxa" w:w="80"/>
+              <w:left w:type="dxa" w:w="120"/>
+              <w:bottom w:type="dxa" w:w="80"/>
+              <w:right w:type="dxa" w:w="120"/>
+            </w:tcMar>
+            <w:vAlign w:val="center"/>
+          </w:tcPr>
+          <w:p>
+            <w:pPr>
+              <w:jc w:val="left"/>
+            </w:pPr>
+            <w:r>
+              <w:rPr>
+                <w:rFonts w:ascii="Calibri" w:cs="Calibri" w:eastAsia="Calibri" w:hAnsi="Calibri"/>
+                <w:b w:val="false"/>
+                <w:bCs w:val="false"/>
+                <w:color w:val="555555"/>
+                <w:sz w:val="16"/>
+                <w:szCs w:val="16"/>
+              </w:rPr>
+              <w:t xml:space="preserve">Sereno → Pioggia → Asciutto (10×)</w:t>
+            </w:r>
+          </w:p>
+        </w:tc>
+      </w:tr>
+      <w:tr>
+        <w:tc>
+          <w:tcPr>
+            <w:tcW w:type="dxa" w:w="720"/>
+            <w:shd w:fill="FFFFFF" w:val="clear"/>
             <w:tcMar>
               <w:top w:type="dxa" w:w="80"/>
               <w:left w:type="dxa" w:w="120"/>
@@ -4218,13 +4411,129 @@
             <w:r>
               <w:rPr>
                 <w:rFonts w:ascii="Calibri" w:cs="Calibri" w:eastAsia="Calibri" w:hAnsi="Calibri"/>
-                <w:b w:val="false"/>
-                <w:bCs w:val="false"/>
-                <w:color w:val="555555"/>
+                <w:b/>
+                <w:bCs/>
+                <w:color w:val="006666"/>
+                <w:sz w:val="18"/>
+                <w:szCs w:val="18"/>
+              </w:rPr>
+              <w:t xml:space="preserve">R4</w:t>
+            </w:r>
+          </w:p>
+        </w:tc>
+        <w:tc>
+          <w:tcPr>
+            <w:tcW w:type="dxa" w:w="2600"/>
+            <w:shd w:fill="FFFFFF" w:val="clear"/>
+            <w:tcMar>
+              <w:top w:type="dxa" w:w="80"/>
+              <w:left w:type="dxa" w:w="120"/>
+              <w:bottom w:type="dxa" w:w="80"/>
+              <w:right w:type="dxa" w:w="120"/>
+            </w:tcMar>
+            <w:vAlign w:val="center"/>
+          </w:tcPr>
+          <w:p>
+            <w:pPr>
+              <w:jc w:val="left"/>
+            </w:pPr>
+            <w:r>
+              <w:rPr>
+                <w:rFonts w:ascii="Calibri" w:cs="Calibri" w:eastAsia="Calibri" w:hAnsi="Calibri"/>
+                <w:b w:val="false"/>
+                <w:bCs w:val="false"/>
+                <w:color w:val="1A1A2E"/>
                 <w:sz w:val="17"/>
                 <w:szCs w:val="17"/>
               </w:rPr>
-              <w:t xml:space="preserve">TBD</w:t>
+              <w:t xml:space="preserve">Fuji Speedway</w:t>
+            </w:r>
+          </w:p>
+        </w:tc>
+        <w:tc>
+          <w:tcPr>
+            <w:tcW w:type="dxa" w:w="1600"/>
+            <w:shd w:fill="FFFFFF" w:val="clear"/>
+            <w:tcMar>
+              <w:top w:type="dxa" w:w="80"/>
+              <w:left w:type="dxa" w:w="120"/>
+              <w:bottom w:type="dxa" w:w="80"/>
+              <w:right w:type="dxa" w:w="120"/>
+            </w:tcMar>
+            <w:vAlign w:val="center"/>
+          </w:tcPr>
+          <w:p>
+            <w:pPr>
+              <w:jc w:val="center"/>
+            </w:pPr>
+            <w:r>
+              <w:rPr>
+                <w:rFonts w:ascii="Calibri" w:cs="Calibri" w:eastAsia="Calibri" w:hAnsi="Calibri"/>
+                <w:b w:val="false"/>
+                <w:bCs w:val="false"/>
+                <w:color w:val="1A1A2E"/>
+                <w:sz w:val="17"/>
+                <w:szCs w:val="17"/>
+              </w:rPr>
+              <w:t xml:space="preserve">25 Ott 2026</w:t>
+            </w:r>
+          </w:p>
+        </w:tc>
+        <w:tc>
+          <w:tcPr>
+            <w:tcW w:type="dxa" w:w="900"/>
+            <w:shd w:fill="FFFFFF" w:val="clear"/>
+            <w:tcMar>
+              <w:top w:type="dxa" w:w="80"/>
+              <w:left w:type="dxa" w:w="120"/>
+              <w:bottom w:type="dxa" w:w="80"/>
+              <w:right w:type="dxa" w:w="120"/>
+            </w:tcMar>
+            <w:vAlign w:val="center"/>
+          </w:tcPr>
+          <w:p>
+            <w:pPr>
+              <w:jc w:val="center"/>
+            </w:pPr>
+            <w:r>
+              <w:rPr>
+                <w:rFonts w:ascii="Calibri" w:cs="Calibri" w:eastAsia="Calibri" w:hAnsi="Calibri"/>
+                <w:b w:val="false"/>
+                <w:bCs w:val="false"/>
+                <w:color w:val="1A1A2E"/>
+                <w:sz w:val="17"/>
+                <w:szCs w:val="17"/>
+              </w:rPr>
+              <w:t xml:space="preserve">13:00</w:t>
+            </w:r>
+          </w:p>
+        </w:tc>
+        <w:tc>
+          <w:tcPr>
+            <w:tcW w:type="dxa" w:w="2252"/>
+            <w:shd w:fill="FFFFFF" w:val="clear"/>
+            <w:tcMar>
+              <w:top w:type="dxa" w:w="80"/>
+              <w:left w:type="dxa" w:w="120"/>
+              <w:bottom w:type="dxa" w:w="80"/>
+              <w:right w:type="dxa" w:w="120"/>
+            </w:tcMar>
+            <w:vAlign w:val="center"/>
+          </w:tcPr>
+          <w:p>
+            <w:pPr>
+              <w:jc w:val="left"/>
+            </w:pPr>
+            <w:r>
+              <w:rPr>
+                <w:rFonts w:ascii="Calibri" w:cs="Calibri" w:eastAsia="Calibri" w:hAnsi="Calibri"/>
+                <w:b w:val="false"/>
+                <w:bCs w:val="false"/>
+                <w:color w:val="555555"/>
+                <w:sz w:val="16"/>
+                <w:szCs w:val="16"/>
+              </w:rPr>
+              <w:t xml:space="preserve">Nuvoloso → Nebbia → Sereno (4×)</w:t>
             </w:r>
           </w:p>
         </w:tc>
@@ -4232,7 +4541,8 @@
       <w:tr>
         <w:tc>
           <w:tcPr>
-            <w:tcW w:type="dxa" w:w="900"/>
+            <w:tcW w:type="dxa" w:w="720"/>
+            <w:shd w:fill="E8E8E8" w:val="clear"/>
             <w:tcMar>
               <w:top w:type="dxa" w:w="80"/>
               <w:left w:type="dxa" w:w="120"/>
@@ -4250,17 +4560,18 @@
                 <w:rFonts w:ascii="Calibri" w:cs="Calibri" w:eastAsia="Calibri" w:hAnsi="Calibri"/>
                 <w:b/>
                 <w:bCs/>
-                <w:color w:val="1A1A2E"/>
+                <w:color w:val="006666"/>
                 <w:sz w:val="18"/>
                 <w:szCs w:val="18"/>
               </w:rPr>
-              <w:t xml:space="preserve">R3</w:t>
-            </w:r>
-          </w:p>
-        </w:tc>
-        <w:tc>
-          <w:tcPr>
-            <w:tcW w:type="dxa" w:w="2800"/>
+              <w:t xml:space="preserve">R5</w:t>
+            </w:r>
+          </w:p>
+        </w:tc>
+        <w:tc>
+          <w:tcPr>
+            <w:tcW w:type="dxa" w:w="2600"/>
+            <w:shd w:fill="E8E8E8" w:val="clear"/>
             <w:tcMar>
               <w:top w:type="dxa" w:w="80"/>
               <w:left w:type="dxa" w:w="120"/>
@@ -4278,17 +4589,18 @@
                 <w:rFonts w:ascii="Calibri" w:cs="Calibri" w:eastAsia="Calibri" w:hAnsi="Calibri"/>
                 <w:b w:val="false"/>
                 <w:bCs w:val="false"/>
-                <w:color w:val="555555"/>
+                <w:color w:val="1A1A2E"/>
                 <w:sz w:val="17"/>
                 <w:szCs w:val="17"/>
               </w:rPr>
-              <w:t xml:space="preserve">TBD</w:t>
-            </w:r>
-          </w:p>
-        </w:tc>
-        <w:tc>
-          <w:tcPr>
-            <w:tcW w:type="dxa" w:w="2200"/>
+              <w:t xml:space="preserve">Autodromo Nazionale Monza</w:t>
+            </w:r>
+          </w:p>
+        </w:tc>
+        <w:tc>
+          <w:tcPr>
+            <w:tcW w:type="dxa" w:w="1600"/>
+            <w:shd w:fill="E8E8E8" w:val="clear"/>
             <w:tcMar>
               <w:top w:type="dxa" w:w="80"/>
               <w:left w:type="dxa" w:w="120"/>
@@ -4306,17 +4618,18 @@
                 <w:rFonts w:ascii="Calibri" w:cs="Calibri" w:eastAsia="Calibri" w:hAnsi="Calibri"/>
                 <w:b w:val="false"/>
                 <w:bCs w:val="false"/>
-                <w:color w:val="555555"/>
+                <w:color w:val="1A1A2E"/>
                 <w:sz w:val="17"/>
                 <w:szCs w:val="17"/>
               </w:rPr>
-              <w:t xml:space="preserve">TBD</w:t>
-            </w:r>
-          </w:p>
-        </w:tc>
-        <w:tc>
-          <w:tcPr>
-            <w:tcW w:type="dxa" w:w="1586"/>
+              <w:t xml:space="preserve">08 Nov 2026</w:t>
+            </w:r>
+          </w:p>
+        </w:tc>
+        <w:tc>
+          <w:tcPr>
+            <w:tcW w:type="dxa" w:w="900"/>
+            <w:shd w:fill="E8E8E8" w:val="clear"/>
             <w:tcMar>
               <w:top w:type="dxa" w:w="80"/>
               <w:left w:type="dxa" w:w="120"/>
@@ -4334,17 +4647,49 @@
                 <w:rFonts w:ascii="Calibri" w:cs="Calibri" w:eastAsia="Calibri" w:hAnsi="Calibri"/>
                 <w:b w:val="false"/>
                 <w:bCs w:val="false"/>
-                <w:color w:val="555555"/>
+                <w:color w:val="1A1A2E"/>
                 <w:sz w:val="17"/>
                 <w:szCs w:val="17"/>
               </w:rPr>
-              <w:t xml:space="preserve">TBD</w:t>
-            </w:r>
-          </w:p>
-        </w:tc>
-        <w:tc>
-          <w:tcPr>
-            <w:tcW w:type="dxa" w:w="1586"/>
+              <w:t xml:space="preserve">13:00</w:t>
+            </w:r>
+          </w:p>
+        </w:tc>
+        <w:tc>
+          <w:tcPr>
+            <w:tcW w:type="dxa" w:w="2252"/>
+            <w:shd w:fill="E8E8E8" w:val="clear"/>
+            <w:tcMar>
+              <w:top w:type="dxa" w:w="80"/>
+              <w:left w:type="dxa" w:w="120"/>
+              <w:bottom w:type="dxa" w:w="80"/>
+              <w:right w:type="dxa" w:w="120"/>
+            </w:tcMar>
+            <w:vAlign w:val="center"/>
+          </w:tcPr>
+          <w:p>
+            <w:pPr>
+              <w:jc w:val="left"/>
+            </w:pPr>
+            <w:r>
+              <w:rPr>
+                <w:rFonts w:ascii="Calibri" w:cs="Calibri" w:eastAsia="Calibri" w:hAnsi="Calibri"/>
+                <w:b w:val="false"/>
+                <w:bCs w:val="false"/>
+                <w:color w:val="555555"/>
+                <w:sz w:val="16"/>
+                <w:szCs w:val="16"/>
+              </w:rPr>
+              <w:t xml:space="preserve">Sereno e Caldo (2×)</w:t>
+            </w:r>
+          </w:p>
+        </w:tc>
+      </w:tr>
+      <w:tr>
+        <w:tc>
+          <w:tcPr>
+            <w:tcW w:type="dxa" w:w="720"/>
+            <w:shd w:fill="FFFFFF" w:val="clear"/>
             <w:tcMar>
               <w:top w:type="dxa" w:w="80"/>
               <w:left w:type="dxa" w:w="120"/>
@@ -4360,21 +4705,49 @@
             <w:r>
               <w:rPr>
                 <w:rFonts w:ascii="Calibri" w:cs="Calibri" w:eastAsia="Calibri" w:hAnsi="Calibri"/>
-                <w:b w:val="false"/>
-                <w:bCs w:val="false"/>
-                <w:color w:val="555555"/>
+                <w:b/>
+                <w:bCs/>
+                <w:color w:val="006666"/>
+                <w:sz w:val="18"/>
+                <w:szCs w:val="18"/>
+              </w:rPr>
+              <w:t xml:space="preserve">R6</w:t>
+            </w:r>
+          </w:p>
+        </w:tc>
+        <w:tc>
+          <w:tcPr>
+            <w:tcW w:type="dxa" w:w="2600"/>
+            <w:shd w:fill="FFFFFF" w:val="clear"/>
+            <w:tcMar>
+              <w:top w:type="dxa" w:w="80"/>
+              <w:left w:type="dxa" w:w="120"/>
+              <w:bottom w:type="dxa" w:w="80"/>
+              <w:right w:type="dxa" w:w="120"/>
+            </w:tcMar>
+            <w:vAlign w:val="center"/>
+          </w:tcPr>
+          <w:p>
+            <w:pPr>
+              <w:jc w:val="left"/>
+            </w:pPr>
+            <w:r>
+              <w:rPr>
+                <w:rFonts w:ascii="Calibri" w:cs="Calibri" w:eastAsia="Calibri" w:hAnsi="Calibri"/>
+                <w:b w:val="false"/>
+                <w:bCs w:val="false"/>
+                <w:color w:val="1A1A2E"/>
                 <w:sz w:val="17"/>
                 <w:szCs w:val="17"/>
               </w:rPr>
-              <w:t xml:space="preserve">TBD</w:t>
-            </w:r>
-          </w:p>
-        </w:tc>
-      </w:tr>
-      <w:tr>
-        <w:tc>
-          <w:tcPr>
-            <w:tcW w:type="dxa" w:w="900"/>
+              <w:t xml:space="preserve">Circuit des 24 Heures du Mans</w:t>
+            </w:r>
+          </w:p>
+        </w:tc>
+        <w:tc>
+          <w:tcPr>
+            <w:tcW w:type="dxa" w:w="1600"/>
+            <w:shd w:fill="FFFFFF" w:val="clear"/>
             <w:tcMar>
               <w:top w:type="dxa" w:w="80"/>
               <w:left w:type="dxa" w:w="120"/>
@@ -4390,47 +4763,20 @@
             <w:r>
               <w:rPr>
                 <w:rFonts w:ascii="Calibri" w:cs="Calibri" w:eastAsia="Calibri" w:hAnsi="Calibri"/>
-                <w:b/>
-                <w:bCs/>
+                <w:b w:val="false"/>
+                <w:bCs w:val="false"/>
                 <w:color w:val="1A1A2E"/>
-                <w:sz w:val="18"/>
-                <w:szCs w:val="18"/>
-              </w:rPr>
-              <w:t xml:space="preserve">R4</w:t>
-            </w:r>
-          </w:p>
-        </w:tc>
-        <w:tc>
-          <w:tcPr>
-            <w:tcW w:type="dxa" w:w="2800"/>
-            <w:tcMar>
-              <w:top w:type="dxa" w:w="80"/>
-              <w:left w:type="dxa" w:w="120"/>
-              <w:bottom w:type="dxa" w:w="80"/>
-              <w:right w:type="dxa" w:w="120"/>
-            </w:tcMar>
-            <w:vAlign w:val="center"/>
-          </w:tcPr>
-          <w:p>
-            <w:pPr>
-              <w:jc w:val="left"/>
-            </w:pPr>
-            <w:r>
-              <w:rPr>
-                <w:rFonts w:ascii="Calibri" w:cs="Calibri" w:eastAsia="Calibri" w:hAnsi="Calibri"/>
-                <w:b w:val="false"/>
-                <w:bCs w:val="false"/>
-                <w:color w:val="555555"/>
                 <w:sz w:val="17"/>
                 <w:szCs w:val="17"/>
               </w:rPr>
-              <w:t xml:space="preserve">TBD</w:t>
-            </w:r>
-          </w:p>
-        </w:tc>
-        <w:tc>
-          <w:tcPr>
-            <w:tcW w:type="dxa" w:w="2200"/>
+              <w:t xml:space="preserve">22 Nov 2026</w:t>
+            </w:r>
+          </w:p>
+        </w:tc>
+        <w:tc>
+          <w:tcPr>
+            <w:tcW w:type="dxa" w:w="900"/>
+            <w:shd w:fill="FFFFFF" w:val="clear"/>
             <w:tcMar>
               <w:top w:type="dxa" w:w="80"/>
               <w:left w:type="dxa" w:w="120"/>
@@ -4448,28 +4794,29 @@
                 <w:rFonts w:ascii="Calibri" w:cs="Calibri" w:eastAsia="Calibri" w:hAnsi="Calibri"/>
                 <w:b w:val="false"/>
                 <w:bCs w:val="false"/>
-                <w:color w:val="555555"/>
+                <w:color w:val="1A1A2E"/>
                 <w:sz w:val="17"/>
                 <w:szCs w:val="17"/>
               </w:rPr>
-              <w:t xml:space="preserve">TBD</w:t>
-            </w:r>
-          </w:p>
-        </w:tc>
-        <w:tc>
-          <w:tcPr>
-            <w:tcW w:type="dxa" w:w="1586"/>
-            <w:tcMar>
-              <w:top w:type="dxa" w:w="80"/>
-              <w:left w:type="dxa" w:w="120"/>
-              <w:bottom w:type="dxa" w:w="80"/>
-              <w:right w:type="dxa" w:w="120"/>
-            </w:tcMar>
-            <w:vAlign w:val="center"/>
-          </w:tcPr>
-          <w:p>
-            <w:pPr>
-              <w:jc w:val="center"/>
+              <w:t xml:space="preserve">16:00</w:t>
+            </w:r>
+          </w:p>
+        </w:tc>
+        <w:tc>
+          <w:tcPr>
+            <w:tcW w:type="dxa" w:w="2252"/>
+            <w:shd w:fill="FFFFFF" w:val="clear"/>
+            <w:tcMar>
+              <w:top w:type="dxa" w:w="80"/>
+              <w:left w:type="dxa" w:w="120"/>
+              <w:bottom w:type="dxa" w:w="80"/>
+              <w:right w:type="dxa" w:w="120"/>
+            </w:tcMar>
+            <w:vAlign w:val="center"/>
+          </w:tcPr>
+          <w:p>
+            <w:pPr>
+              <w:jc w:val="left"/>
             </w:pPr>
             <w:r>
               <w:rPr>
@@ -4477,322 +4824,10 @@
                 <w:b w:val="false"/>
                 <w:bCs w:val="false"/>
                 <w:color w:val="555555"/>
-                <w:sz w:val="17"/>
-                <w:szCs w:val="17"/>
-              </w:rPr>
-              <w:t xml:space="preserve">TBD</w:t>
-            </w:r>
-          </w:p>
-        </w:tc>
-        <w:tc>
-          <w:tcPr>
-            <w:tcW w:type="dxa" w:w="1586"/>
-            <w:tcMar>
-              <w:top w:type="dxa" w:w="80"/>
-              <w:left w:type="dxa" w:w="120"/>
-              <w:bottom w:type="dxa" w:w="80"/>
-              <w:right w:type="dxa" w:w="120"/>
-            </w:tcMar>
-            <w:vAlign w:val="center"/>
-          </w:tcPr>
-          <w:p>
-            <w:pPr>
-              <w:jc w:val="center"/>
-            </w:pPr>
-            <w:r>
-              <w:rPr>
-                <w:rFonts w:ascii="Calibri" w:cs="Calibri" w:eastAsia="Calibri" w:hAnsi="Calibri"/>
-                <w:b w:val="false"/>
-                <w:bCs w:val="false"/>
-                <w:color w:val="555555"/>
-                <w:sz w:val="17"/>
-                <w:szCs w:val="17"/>
-              </w:rPr>
-              <w:t xml:space="preserve">TBD</w:t>
-            </w:r>
-          </w:p>
-        </w:tc>
-      </w:tr>
-      <w:tr>
-        <w:tc>
-          <w:tcPr>
-            <w:tcW w:type="dxa" w:w="900"/>
-            <w:tcMar>
-              <w:top w:type="dxa" w:w="80"/>
-              <w:left w:type="dxa" w:w="120"/>
-              <w:bottom w:type="dxa" w:w="80"/>
-              <w:right w:type="dxa" w:w="120"/>
-            </w:tcMar>
-            <w:vAlign w:val="center"/>
-          </w:tcPr>
-          <w:p>
-            <w:pPr>
-              <w:jc w:val="center"/>
-            </w:pPr>
-            <w:r>
-              <w:rPr>
-                <w:rFonts w:ascii="Calibri" w:cs="Calibri" w:eastAsia="Calibri" w:hAnsi="Calibri"/>
-                <w:b/>
-                <w:bCs/>
-                <w:color w:val="1A1A2E"/>
-                <w:sz w:val="18"/>
-                <w:szCs w:val="18"/>
-              </w:rPr>
-              <w:t xml:space="preserve">R5</w:t>
-            </w:r>
-          </w:p>
-        </w:tc>
-        <w:tc>
-          <w:tcPr>
-            <w:tcW w:type="dxa" w:w="2800"/>
-            <w:tcMar>
-              <w:top w:type="dxa" w:w="80"/>
-              <w:left w:type="dxa" w:w="120"/>
-              <w:bottom w:type="dxa" w:w="80"/>
-              <w:right w:type="dxa" w:w="120"/>
-            </w:tcMar>
-            <w:vAlign w:val="center"/>
-          </w:tcPr>
-          <w:p>
-            <w:pPr>
-              <w:jc w:val="left"/>
-            </w:pPr>
-            <w:r>
-              <w:rPr>
-                <w:rFonts w:ascii="Calibri" w:cs="Calibri" w:eastAsia="Calibri" w:hAnsi="Calibri"/>
-                <w:b w:val="false"/>
-                <w:bCs w:val="false"/>
-                <w:color w:val="555555"/>
-                <w:sz w:val="17"/>
-                <w:szCs w:val="17"/>
-              </w:rPr>
-              <w:t xml:space="preserve">TBD</w:t>
-            </w:r>
-          </w:p>
-        </w:tc>
-        <w:tc>
-          <w:tcPr>
-            <w:tcW w:type="dxa" w:w="2200"/>
-            <w:tcMar>
-              <w:top w:type="dxa" w:w="80"/>
-              <w:left w:type="dxa" w:w="120"/>
-              <w:bottom w:type="dxa" w:w="80"/>
-              <w:right w:type="dxa" w:w="120"/>
-            </w:tcMar>
-            <w:vAlign w:val="center"/>
-          </w:tcPr>
-          <w:p>
-            <w:pPr>
-              <w:jc w:val="center"/>
-            </w:pPr>
-            <w:r>
-              <w:rPr>
-                <w:rFonts w:ascii="Calibri" w:cs="Calibri" w:eastAsia="Calibri" w:hAnsi="Calibri"/>
-                <w:b w:val="false"/>
-                <w:bCs w:val="false"/>
-                <w:color w:val="555555"/>
-                <w:sz w:val="17"/>
-                <w:szCs w:val="17"/>
-              </w:rPr>
-              <w:t xml:space="preserve">TBD</w:t>
-            </w:r>
-          </w:p>
-        </w:tc>
-        <w:tc>
-          <w:tcPr>
-            <w:tcW w:type="dxa" w:w="1586"/>
-            <w:tcMar>
-              <w:top w:type="dxa" w:w="80"/>
-              <w:left w:type="dxa" w:w="120"/>
-              <w:bottom w:type="dxa" w:w="80"/>
-              <w:right w:type="dxa" w:w="120"/>
-            </w:tcMar>
-            <w:vAlign w:val="center"/>
-          </w:tcPr>
-          <w:p>
-            <w:pPr>
-              <w:jc w:val="center"/>
-            </w:pPr>
-            <w:r>
-              <w:rPr>
-                <w:rFonts w:ascii="Calibri" w:cs="Calibri" w:eastAsia="Calibri" w:hAnsi="Calibri"/>
-                <w:b w:val="false"/>
-                <w:bCs w:val="false"/>
-                <w:color w:val="555555"/>
-                <w:sz w:val="17"/>
-                <w:szCs w:val="17"/>
-              </w:rPr>
-              <w:t xml:space="preserve">TBD</w:t>
-            </w:r>
-          </w:p>
-        </w:tc>
-        <w:tc>
-          <w:tcPr>
-            <w:tcW w:type="dxa" w:w="1586"/>
-            <w:tcMar>
-              <w:top w:type="dxa" w:w="80"/>
-              <w:left w:type="dxa" w:w="120"/>
-              <w:bottom w:type="dxa" w:w="80"/>
-              <w:right w:type="dxa" w:w="120"/>
-            </w:tcMar>
-            <w:vAlign w:val="center"/>
-          </w:tcPr>
-          <w:p>
-            <w:pPr>
-              <w:jc w:val="center"/>
-            </w:pPr>
-            <w:r>
-              <w:rPr>
-                <w:rFonts w:ascii="Calibri" w:cs="Calibri" w:eastAsia="Calibri" w:hAnsi="Calibri"/>
-                <w:b w:val="false"/>
-                <w:bCs w:val="false"/>
-                <w:color w:val="555555"/>
-                <w:sz w:val="17"/>
-                <w:szCs w:val="17"/>
-              </w:rPr>
-              <w:t xml:space="preserve">TBD</w:t>
-            </w:r>
-          </w:p>
-        </w:tc>
-      </w:tr>
-      <w:tr>
-        <w:tc>
-          <w:tcPr>
-            <w:tcW w:type="dxa" w:w="900"/>
-            <w:tcMar>
-              <w:top w:type="dxa" w:w="80"/>
-              <w:left w:type="dxa" w:w="120"/>
-              <w:bottom w:type="dxa" w:w="80"/>
-              <w:right w:type="dxa" w:w="120"/>
-            </w:tcMar>
-            <w:vAlign w:val="center"/>
-          </w:tcPr>
-          <w:p>
-            <w:pPr>
-              <w:jc w:val="center"/>
-            </w:pPr>
-            <w:r>
-              <w:rPr>
-                <w:rFonts w:ascii="Calibri" w:cs="Calibri" w:eastAsia="Calibri" w:hAnsi="Calibri"/>
-                <w:b/>
-                <w:bCs/>
-                <w:color w:val="1A1A2E"/>
-                <w:sz w:val="18"/>
-                <w:szCs w:val="18"/>
-              </w:rPr>
-              <w:t xml:space="preserve">R6</w:t>
-            </w:r>
-          </w:p>
-        </w:tc>
-        <w:tc>
-          <w:tcPr>
-            <w:tcW w:type="dxa" w:w="2800"/>
-            <w:tcMar>
-              <w:top w:type="dxa" w:w="80"/>
-              <w:left w:type="dxa" w:w="120"/>
-              <w:bottom w:type="dxa" w:w="80"/>
-              <w:right w:type="dxa" w:w="120"/>
-            </w:tcMar>
-            <w:vAlign w:val="center"/>
-          </w:tcPr>
-          <w:p>
-            <w:pPr>
-              <w:jc w:val="left"/>
-            </w:pPr>
-            <w:r>
-              <w:rPr>
-                <w:rFonts w:ascii="Calibri" w:cs="Calibri" w:eastAsia="Calibri" w:hAnsi="Calibri"/>
-                <w:b w:val="false"/>
-                <w:bCs w:val="false"/>
-                <w:color w:val="555555"/>
-                <w:sz w:val="17"/>
-                <w:szCs w:val="17"/>
-              </w:rPr>
-              <w:t xml:space="preserve">TBD</w:t>
-            </w:r>
-          </w:p>
-        </w:tc>
-        <w:tc>
-          <w:tcPr>
-            <w:tcW w:type="dxa" w:w="2200"/>
-            <w:tcMar>
-              <w:top w:type="dxa" w:w="80"/>
-              <w:left w:type="dxa" w:w="120"/>
-              <w:bottom w:type="dxa" w:w="80"/>
-              <w:right w:type="dxa" w:w="120"/>
-            </w:tcMar>
-            <w:vAlign w:val="center"/>
-          </w:tcPr>
-          <w:p>
-            <w:pPr>
-              <w:jc w:val="center"/>
-            </w:pPr>
-            <w:r>
-              <w:rPr>
-                <w:rFonts w:ascii="Calibri" w:cs="Calibri" w:eastAsia="Calibri" w:hAnsi="Calibri"/>
-                <w:b w:val="false"/>
-                <w:bCs w:val="false"/>
-                <w:color w:val="555555"/>
-                <w:sz w:val="17"/>
-                <w:szCs w:val="17"/>
-              </w:rPr>
-              <w:t xml:space="preserve">TBD</w:t>
-            </w:r>
-          </w:p>
-        </w:tc>
-        <w:tc>
-          <w:tcPr>
-            <w:tcW w:type="dxa" w:w="1586"/>
-            <w:tcMar>
-              <w:top w:type="dxa" w:w="80"/>
-              <w:left w:type="dxa" w:w="120"/>
-              <w:bottom w:type="dxa" w:w="80"/>
-              <w:right w:type="dxa" w:w="120"/>
-            </w:tcMar>
-            <w:vAlign w:val="center"/>
-          </w:tcPr>
-          <w:p>
-            <w:pPr>
-              <w:jc w:val="center"/>
-            </w:pPr>
-            <w:r>
-              <w:rPr>
-                <w:rFonts w:ascii="Calibri" w:cs="Calibri" w:eastAsia="Calibri" w:hAnsi="Calibri"/>
-                <w:b w:val="false"/>
-                <w:bCs w:val="false"/>
-                <w:color w:val="555555"/>
-                <w:sz w:val="17"/>
-                <w:szCs w:val="17"/>
-              </w:rPr>
-              <w:t xml:space="preserve">TBD</w:t>
-            </w:r>
-          </w:p>
-        </w:tc>
-        <w:tc>
-          <w:tcPr>
-            <w:tcW w:type="dxa" w:w="1586"/>
-            <w:tcMar>
-              <w:top w:type="dxa" w:w="80"/>
-              <w:left w:type="dxa" w:w="120"/>
-              <w:bottom w:type="dxa" w:w="80"/>
-              <w:right w:type="dxa" w:w="120"/>
-            </w:tcMar>
-            <w:vAlign w:val="center"/>
-          </w:tcPr>
-          <w:p>
-            <w:pPr>
-              <w:jc w:val="center"/>
-            </w:pPr>
-            <w:r>
-              <w:rPr>
-                <w:rFonts w:ascii="Calibri" w:cs="Calibri" w:eastAsia="Calibri" w:hAnsi="Calibri"/>
-                <w:b w:val="false"/>
-                <w:bCs w:val="false"/>
-                <w:color w:val="555555"/>
-                <w:sz w:val="17"/>
-                <w:szCs w:val="17"/>
-              </w:rPr>
-              <w:t xml:space="preserve">TBD</w:t>
+                <w:sz w:val="16"/>
+                <w:szCs w:val="16"/>
+              </w:rPr>
+              <w:t xml:space="preserve">Variabile → Notte → Alba (10×)</w:t>
             </w:r>
           </w:p>
         </w:tc>
@@ -4823,7 +4858,7 @@
           <w:sz w:val="26"/>
           <w:szCs w:val="26"/>
         </w:rPr>
-        <w:t xml:space="preserve">9. PROTESTE E APPELLI</w:t>
+        <w:t xml:space="preserve">9. PROTESTE E DIREZIONE GARA</w:t>
       </w:r>
     </w:p>
     <w:p>
@@ -4866,7 +4901,7 @@
           <w:sz w:val="20"/>
           <w:szCs w:val="20"/>
         </w:rPr>
-        <w:t xml:space="preserve">Proteste via canale #ue144-proteste su Discord</w:t>
+        <w:t xml:space="preserve">Proteste via apposito canale Discord entro 30 minuti dal termine della sessione</w:t>
       </w:r>
     </w:p>
     <w:p>
@@ -4892,7 +4927,7 @@
           <w:sz w:val="20"/>
           <w:szCs w:val="20"/>
         </w:rPr>
-        <w:t xml:space="preserve">Termine: entro 30 minuti dal termine della sessione</w:t>
+        <w:t xml:space="preserve">Allegare obbligatoriamente: clip video e telemetria</w:t>
       </w:r>
     </w:p>
     <w:p>
@@ -4918,24 +4953,7 @@
           <w:sz w:val="20"/>
           <w:szCs w:val="20"/>
         </w:rPr>
-        <w:t xml:space="preserve">Formato richiesto: giro, piloti coinvolti, descrizione, clip video (obbligatoria)</w:t>
-      </w:r>
-    </w:p>
-    <w:p>
-      <w:pPr>
-        <w:pStyle w:val="Heading2"/>
-        <w:spacing w:after="80" w:before="240"/>
-      </w:pPr>
-      <w:r>
-        <w:rPr>
-          <w:rFonts w:ascii="Calibri" w:cs="Calibri" w:eastAsia="Calibri" w:hAnsi="Calibri"/>
-          <w:b/>
-          <w:bCs/>
-          <w:color w:val="F5A623"/>
-          <w:sz w:val="22"/>
-          <w:szCs w:val="22"/>
-        </w:rPr>
-        <w:t xml:space="preserve">9.2 Decisioni</w:t>
+        <w:t xml:space="preserve">Le decisioni dello staff sono inappellabili e basate esclusivamente sui dati</w:t>
       </w:r>
     </w:p>
     <w:p>
@@ -4961,33 +4979,7 @@
           <w:sz w:val="20"/>
           <w:szCs w:val="20"/>
         </w:rPr>
-        <w:t xml:space="preserve">Staff esamina il materiale e pubblica la decisione entro 24 ore</w:t>
-      </w:r>
-    </w:p>
-    <w:p>
-      <w:pPr>
-        <w:spacing w:after="60" w:before="60"/>
-        <w:ind w:left="504"/>
-      </w:pPr>
-      <w:r>
-        <w:rPr>
-          <w:rFonts w:ascii="Calibri" w:cs="Calibri" w:eastAsia="Calibri" w:hAnsi="Calibri"/>
-          <w:b/>
-          <w:bCs/>
-          <w:color w:val="00D9FF"/>
-          <w:sz w:val="20"/>
-          <w:szCs w:val="20"/>
-        </w:rPr>
-        <w:t xml:space="preserve">▸  </w:t>
-      </w:r>
-      <w:r>
-        <w:rPr>
-          <w:rFonts w:ascii="Calibri" w:cs="Calibri" w:eastAsia="Calibri" w:hAnsi="Calibri"/>
-          <w:color w:val="1A1A2E"/>
-          <w:sz w:val="20"/>
-          <w:szCs w:val="20"/>
-        </w:rPr>
-        <w:t xml:space="preserve">Le decisioni dello staff sono inappellabili salvo nuove prove</w:t>
+        <w:t xml:space="preserve">L'iscrizione al campionato implica la piena accettazione del presente regolamento</w:t>
       </w:r>
     </w:p>
     <w:p>
@@ -5008,7 +5000,7 @@
           <w:sz w:val="18"/>
           <w:szCs w:val="18"/>
         </w:rPr>
-        <w:t xml:space="preserve">⚠  Proteste senza clip video non saranno prese in considerazione.</w:t>
+        <w:t xml:space="preserve">⚠  Proteste senza clip video e telemetria non saranno prese in considerazione.</w:t>
       </w:r>
     </w:p>
     <w:p>

</xml_diff>

<commit_message>
fix(ue144): telemetria consigliata, non obbligatoria — clip video resta richiesta
</commit_message>
<xml_diff>
--- a/docs/ue144/ue144_regolamento.docx
+++ b/docs/ue144/ue144_regolamento.docx
@@ -4927,7 +4927,7 @@
           <w:sz w:val="20"/>
           <w:szCs w:val="20"/>
         </w:rPr>
-        <w:t xml:space="preserve">Allegare obbligatoriamente: clip video e telemetria</w:t>
+        <w:t xml:space="preserve">Allegare obbligatoriamente: clip video (telemetria consigliata)</w:t>
       </w:r>
     </w:p>
     <w:p>
@@ -5000,7 +5000,7 @@
           <w:sz w:val="18"/>
           <w:szCs w:val="18"/>
         </w:rPr>
-        <w:t xml:space="preserve">⚠  Proteste senza clip video e telemetria non saranno prese in considerazione.</w:t>
+        <w:t xml:space="preserve">⚠  Proteste senza clip video non saranno prese in considerazione.</w:t>
       </w:r>
     </w:p>
     <w:p>

</xml_diff>

<commit_message>
fix(ue144): campionato aperto a tutti — rimosso requisito membership VSD
</commit_message>
<xml_diff>
--- a/docs/ue144/ue144_regolamento.docx
+++ b/docs/ue144/ue144_regolamento.docx
@@ -4,7 +4,7 @@
   <w:body>
     <w:p>
       <w:pPr>
-        <w:spacing w:after="0" w:before="600"/>
+        <w:spacing w:after="0" w:before="400"/>
       </w:pPr>
     </w:p>
     <w:p>
@@ -13,6 +13,57 @@
         <w:jc w:val="center"/>
       </w:pPr>
       <w:r>
+        <w:drawing>
+          <wp:inline distT="0" distB="0" distL="0" distR="0">
+            <wp:extent cx="1714500" cy="1143000"/>
+            <wp:effectExtent t="0" r="0" b="0" l="0"/>
+            <wp:docPr id="1" name="" descr="" title=""/>
+            <wp:cNvGraphicFramePr>
+              <a:graphicFrameLocks xmlns:a="http://schemas.openxmlformats.org/drawingml/2006/main" noChangeAspect="1"/>
+            </wp:cNvGraphicFramePr>
+            <a:graphic xmlns:a="http://schemas.openxmlformats.org/drawingml/2006/main">
+              <a:graphicData uri="http://schemas.openxmlformats.org/drawingml/2006/picture">
+                <pic:pic xmlns:pic="http://schemas.openxmlformats.org/drawingml/2006/picture">
+                  <pic:nvPicPr>
+                    <pic:cNvPr id="0" name="" descr=""/>
+                    <pic:cNvPicPr>
+                      <a:picLocks noChangeAspect="1" noChangeArrowheads="1"/>
+                    </pic:cNvPicPr>
+                  </pic:nvPicPr>
+                  <pic:blipFill>
+                    <a:blip r:embed="rId7" cstate="none"/>
+                    <a:srcRect/>
+                    <a:stretch>
+                      <a:fillRect/>
+                    </a:stretch>
+                  </pic:blipFill>
+                  <pic:spPr bwMode="auto">
+                    <a:xfrm>
+                      <a:off x="0" y="0"/>
+                      <a:ext cx="1714500" cy="1143000"/>
+                    </a:xfrm>
+                    <a:prstGeom prst="rect">
+                      <a:avLst/>
+                    </a:prstGeom>
+                  </pic:spPr>
+                </pic:pic>
+              </a:graphicData>
+            </a:graphic>
+          </wp:inline>
+        </w:drawing>
+      </w:r>
+    </w:p>
+    <w:p>
+      <w:pPr>
+        <w:spacing w:after="0" w:before="120"/>
+      </w:pPr>
+    </w:p>
+    <w:p>
+      <w:pPr>
+        <w:spacing w:after="0" w:before="0"/>
+        <w:jc w:val="center"/>
+      </w:pPr>
+      <w:r>
         <w:rPr>
           <w:rFonts w:ascii="Courier New" w:cs="Courier New" w:eastAsia="Courier New" w:hAnsi="Courier New"/>
           <w:color w:val="00D9FF"/>
@@ -24,7 +75,7 @@
     </w:p>
     <w:p>
       <w:pPr>
-        <w:spacing w:after="0" w:before="160"/>
+        <w:spacing w:after="0" w:before="120"/>
       </w:pPr>
     </w:p>
     <w:p>
@@ -80,7 +131,7 @@
     </w:p>
     <w:p>
       <w:pPr>
-        <w:spacing w:after="0" w:before="160"/>
+        <w:spacing w:after="0" w:before="120"/>
       </w:pPr>
     </w:p>
     <w:p>
@@ -100,7 +151,7 @@
     </w:p>
     <w:p>
       <w:pPr>
-        <w:spacing w:after="0" w:before="200"/>
+        <w:spacing w:after="0" w:before="180"/>
       </w:pPr>
     </w:p>
     <w:p>
@@ -136,7 +187,7 @@
     </w:p>
     <w:p>
       <w:pPr>
-        <w:spacing w:after="0" w:before="200"/>
+        <w:spacing w:after="0" w:before="160"/>
       </w:pPr>
     </w:p>
     <w:p>
@@ -192,7 +243,105 @@
     </w:p>
     <w:p>
       <w:pPr>
-        <w:spacing w:after="0" w:before="500"/>
+        <w:spacing w:after="0" w:before="320"/>
+      </w:pPr>
+    </w:p>
+    <w:p>
+      <w:pPr>
+        <w:pBdr>
+          <w:top w:val="single" w:color="E8E8E8" w:sz="4" w:space="0"/>
+        </w:pBdr>
+        <w:spacing w:after="0" w:before="0"/>
+        <w:jc w:val="center"/>
+      </w:pPr>
+      <w:r>
+        <w:rPr>
+          <w:rFonts w:ascii="Calibri" w:cs="Calibri" w:eastAsia="Calibri" w:hAnsi="Calibri"/>
+          <w:b/>
+          <w:bCs/>
+          <w:color w:val="C8C8C8"/>
+          <w:sz w:val="14"/>
+          <w:szCs w:val="14"/>
+        </w:rPr>
+        <w:t xml:space="preserve">CON IL SUPPORTO DI</w:t>
+      </w:r>
+    </w:p>
+    <w:p>
+      <w:pPr>
+        <w:spacing w:after="0" w:before="80"/>
+      </w:pPr>
+    </w:p>
+    <w:p>
+      <w:pPr>
+        <w:spacing w:after="0" w:before="0"/>
+        <w:jc w:val="center"/>
+      </w:pPr>
+      <w:r>
+        <w:drawing>
+          <wp:inline distT="0" distB="0" distL="0" distR="0">
+            <wp:extent cx="762000" cy="762000"/>
+            <wp:effectExtent t="0" r="0" b="0" l="0"/>
+            <wp:docPr id="1" name="" descr="" title=""/>
+            <wp:cNvGraphicFramePr>
+              <a:graphicFrameLocks xmlns:a="http://schemas.openxmlformats.org/drawingml/2006/main" noChangeAspect="1"/>
+            </wp:cNvGraphicFramePr>
+            <a:graphic xmlns:a="http://schemas.openxmlformats.org/drawingml/2006/main">
+              <a:graphicData uri="http://schemas.openxmlformats.org/drawingml/2006/picture">
+                <pic:pic xmlns:pic="http://schemas.openxmlformats.org/drawingml/2006/picture">
+                  <pic:nvPicPr>
+                    <pic:cNvPr id="0" name="" descr=""/>
+                    <pic:cNvPicPr>
+                      <a:picLocks noChangeAspect="1" noChangeArrowheads="1"/>
+                    </pic:cNvPicPr>
+                  </pic:nvPicPr>
+                  <pic:blipFill>
+                    <a:blip r:embed="rId8" cstate="none"/>
+                    <a:srcRect/>
+                    <a:stretch>
+                      <a:fillRect/>
+                    </a:stretch>
+                  </pic:blipFill>
+                  <pic:spPr bwMode="auto">
+                    <a:xfrm>
+                      <a:off x="0" y="0"/>
+                      <a:ext cx="762000" cy="762000"/>
+                    </a:xfrm>
+                    <a:prstGeom prst="rect">
+                      <a:avLst/>
+                    </a:prstGeom>
+                  </pic:spPr>
+                </pic:pic>
+              </a:graphicData>
+            </a:graphic>
+          </wp:inline>
+        </w:drawing>
+      </w:r>
+    </w:p>
+    <w:p>
+      <w:pPr>
+        <w:spacing w:after="0" w:before="60"/>
+      </w:pPr>
+    </w:p>
+    <w:p>
+      <w:pPr>
+        <w:spacing w:after="0" w:before="0"/>
+        <w:jc w:val="center"/>
+      </w:pPr>
+      <w:r>
+        <w:rPr>
+          <w:rFonts w:ascii="Calibri" w:cs="Calibri" w:eastAsia="Calibri" w:hAnsi="Calibri"/>
+          <w:i/>
+          <w:iCs/>
+          <w:color w:val="555555"/>
+          <w:sz w:val="16"/>
+          <w:szCs w:val="16"/>
+        </w:rPr>
+        <w:t xml:space="preserve">Total Paint  ·  totalpaint.it</w:t>
+      </w:r>
+    </w:p>
+    <w:p>
+      <w:pPr>
+        <w:spacing w:after="0" w:before="100"/>
       </w:pPr>
     </w:p>
     <w:p>
@@ -249,7 +398,7 @@
           <w:sz w:val="20"/>
           <w:szCs w:val="20"/>
         </w:rPr>
-        <w:t xml:space="preserve">Il VSD Ultimate Endurance 144' (di seguito "UE144") è il campionato endurance ufficiale di Virtual Sim-Driver (VSD). La serie si disputa interamente su Le Mans Ultimate (LMU) e si sviluppa in round stagionali, ciascuno della durata in-game di 144 minuti.</w:t>
+        <w:t xml:space="preserve">Il VSD Ultimate Endurance 144' (di seguito "UE144") è il campionato endurance ufficiale organizzato da Virtual Sim-Driver (VSD). La serie si disputa interamente su Le Mans Ultimate (LMU) e si sviluppa in round stagionali, ciascuno della durata in-game di 144 minuti.</w:t>
       </w:r>
     </w:p>
     <w:p>
@@ -270,16 +419,13 @@
           <w:sz w:val="20"/>
           <w:szCs w:val="20"/>
         </w:rPr>
-        <w:t xml:space="preserve">Il format multiclasse replica la struttura delle grandi gare di durata reali, con piloti singoli che competono all'interno della propria categoria. L'UE144 è aperto a tutti i piloti VSD in regola con l'iscrizione alla community. Le iscrizioni e i risultati sono gestiti tramite la nostra piattaforma ufficiale.</w:t>
-      </w:r>
-    </w:p>
-    <w:p>
-      <w:pPr>
-        <w:pBdr>
-          <w:bottom w:val="single" w:color="00D9FF" w:sz="6" w:space="4"/>
-        </w:pBdr>
-        <w:spacing w:after="80" w:before="80"/>
-      </w:pPr>
+        <w:t xml:space="preserve">Il format multiclasse replica la struttura delle grandi gare di durata reali, con piloti singoli che competono all'interno della propria categoria. L'UE144 è aperto a tutti i piloti su Le Mans Ultimate, senza alcun requisito di membership VSD. Le iscrizioni vengono gestite tramite SimGrid, piattaforma ufficiale del campionato.</w:t>
+      </w:r>
+    </w:p>
+    <w:p>
+      <w:r>
+        <w:br w:type="page"/>
+      </w:r>
     </w:p>
     <w:p>
       <w:pPr>
@@ -623,7 +769,7 @@
                 <w:sz w:val="17"/>
                 <w:szCs w:val="17"/>
               </w:rPr>
-              <w:t xml:space="preserve">Ferrari 499P, Toyota GR010, Porsche 963, Peugeot 9X8, Cadillac V-Series.R, BMW M Hybrid V8, Alpine A424, Lamborghini SC63</w:t>
+              <w:t xml:space="preserve">Ferrari 499P, Toyota GR010, Porsche 963, Peugeot 9X8, Cadillac V-Series.R, BMW M Hybrid V8, Alpine A424, Lamborghini SC63, Genesis GR90</w:t>
             </w:r>
           </w:p>
         </w:tc>
@@ -857,12 +1003,9 @@
       </w:r>
     </w:p>
     <w:p>
-      <w:pPr>
-        <w:pBdr>
-          <w:bottom w:val="single" w:color="00D9FF" w:sz="6" w:space="4"/>
-        </w:pBdr>
-        <w:spacing w:after="80" w:before="80"/>
-      </w:pPr>
+      <w:r>
+        <w:br w:type="page"/>
+      </w:r>
     </w:p>
     <w:p>
       <w:pPr>
@@ -924,7 +1067,7 @@
           <w:sz w:val="20"/>
           <w:szCs w:val="20"/>
         </w:rPr>
-        <w:t xml:space="preserve">Essere piloti VSD attivi (status active su VSD Paddock)</w:t>
+        <w:t xml:space="preserve">Possedere Le Mans Ultimate su PC</w:t>
       </w:r>
     </w:p>
     <w:p>
@@ -950,7 +1093,7 @@
           <w:sz w:val="20"/>
           <w:szCs w:val="20"/>
         </w:rPr>
-        <w:t xml:space="preserve">Possedere Le Mans Ultimate su PC</w:t>
+        <w:t xml:space="preserve">Disporre di un account SimGrid attivo</w:t>
       </w:r>
     </w:p>
     <w:p>
@@ -976,7 +1119,7 @@
           <w:sz w:val="20"/>
           <w:szCs w:val="20"/>
         </w:rPr>
-        <w:t xml:space="preserve">Disponibilità al briefing pre-gara su Discord</w:t>
+        <w:t xml:space="preserve">Disponibilità al briefing pre-gara su Discord VSD</w:t>
       </w:r>
     </w:p>
     <w:p>
@@ -1002,7 +1145,7 @@
           <w:sz w:val="20"/>
           <w:szCs w:val="20"/>
         </w:rPr>
-        <w:t xml:space="preserve">Rispettare il codice di condotta VSD</w:t>
+        <w:t xml:space="preserve">Rispettare il codice di condotta del campionato durante le sessioni e nelle comunicazioni</w:t>
       </w:r>
     </w:p>
     <w:p>
@@ -1045,7 +1188,7 @@
           <w:sz w:val="20"/>
           <w:szCs w:val="20"/>
         </w:rPr>
-        <w:t xml:space="preserve">Iscrizione tramite SimGrid (piattaforma ufficiale del campionato) e conferma su VSD Paddock</w:t>
+        <w:t xml:space="preserve">Iscrizione tramite SimGrid (piattaforma ufficiale del campionato)</w:t>
       </w:r>
     </w:p>
     <w:p>
@@ -1207,12 +1350,9 @@
       </w:r>
     </w:p>
     <w:p>
-      <w:pPr>
-        <w:pBdr>
-          <w:bottom w:val="single" w:color="00D9FF" w:sz="6" w:space="4"/>
-        </w:pBdr>
-        <w:spacing w:after="80" w:before="80"/>
-      </w:pPr>
+      <w:r>
+        <w:br w:type="page"/>
+      </w:r>
     </w:p>
     <w:p>
       <w:pPr>
@@ -1702,12 +1842,9 @@
       </w:r>
     </w:p>
     <w:p>
-      <w:pPr>
-        <w:pBdr>
-          <w:bottom w:val="single" w:color="00D9FF" w:sz="6" w:space="4"/>
-        </w:pBdr>
-        <w:spacing w:after="80" w:before="80"/>
-      </w:pPr>
+      <w:r>
+        <w:br w:type="page"/>
+      </w:r>
     </w:p>
     <w:p>
       <w:pPr>
@@ -2106,12 +2243,9 @@
       </w:r>
     </w:p>
     <w:p>
-      <w:pPr>
-        <w:pBdr>
-          <w:bottom w:val="single" w:color="00D9FF" w:sz="6" w:space="4"/>
-        </w:pBdr>
-        <w:spacing w:after="80" w:before="80"/>
-      </w:pPr>
+      <w:r>
+        <w:br w:type="page"/>
+      </w:r>
     </w:p>
     <w:p>
       <w:pPr>
@@ -2863,12 +2997,9 @@
       </w:r>
     </w:p>
     <w:p>
-      <w:pPr>
-        <w:pBdr>
-          <w:bottom w:val="single" w:color="00D9FF" w:sz="6" w:space="4"/>
-        </w:pBdr>
-        <w:spacing w:after="80" w:before="80"/>
-      </w:pPr>
+      <w:r>
+        <w:br w:type="page"/>
+      </w:r>
     </w:p>
     <w:p>
       <w:pPr>
@@ -3733,12 +3864,9 @@
       </w:r>
     </w:p>
     <w:p>
-      <w:pPr>
-        <w:pBdr>
-          <w:bottom w:val="single" w:color="00D9FF" w:sz="6" w:space="4"/>
-        </w:pBdr>
-        <w:spacing w:after="80" w:before="80"/>
-      </w:pPr>
+      <w:r>
+        <w:br w:type="page"/>
+      </w:r>
     </w:p>
     <w:p>
       <w:pPr>
@@ -4834,12 +4962,9 @@
       </w:tr>
     </w:tbl>
     <w:p>
-      <w:pPr>
-        <w:pBdr>
-          <w:bottom w:val="single" w:color="00D9FF" w:sz="6" w:space="4"/>
-        </w:pBdr>
-        <w:spacing w:after="80" w:before="80"/>
-      </w:pPr>
+      <w:r>
+        <w:br w:type="page"/>
+      </w:r>
     </w:p>
     <w:p>
       <w:pPr>
@@ -5004,12 +5129,9 @@
       </w:r>
     </w:p>
     <w:p>
-      <w:pPr>
-        <w:pBdr>
-          <w:bottom w:val="single" w:color="00D9FF" w:sz="6" w:space="4"/>
-        </w:pBdr>
-        <w:spacing w:after="80" w:before="80"/>
-      </w:pPr>
+      <w:r>
+        <w:br w:type="page"/>
+      </w:r>
     </w:p>
     <w:p>
       <w:pPr>

</xml_diff>

<commit_message>
feat: aggiornate classi UE144, rimosso punto pole da regolamento e paddock
</commit_message>
<xml_diff>
--- a/docs/ue144/ue144_regolamento.docx
+++ b/docs/ue144/ue144_regolamento.docx
@@ -3681,32 +3681,6 @@
           <w:szCs w:val="22"/>
         </w:rPr>
         <w:t xml:space="preserve">7.2 Punti bonus</w:t>
-      </w:r>
-    </w:p>
-    <w:p>
-      <w:pPr>
-        <w:spacing w:after="60" w:before="60"/>
-        <w:ind w:left="504"/>
-      </w:pPr>
-      <w:r>
-        <w:rPr>
-          <w:rFonts w:ascii="Calibri" w:cs="Calibri" w:eastAsia="Calibri" w:hAnsi="Calibri"/>
-          <w:b/>
-          <w:bCs/>
-          <w:color w:val="00D9FF"/>
-          <w:sz w:val="20"/>
-          <w:szCs w:val="20"/>
-        </w:rPr>
-        <w:t xml:space="preserve">▸  </w:t>
-      </w:r>
-      <w:r>
-        <w:rPr>
-          <w:rFonts w:ascii="Calibri" w:cs="Calibri" w:eastAsia="Calibri" w:hAnsi="Calibri"/>
-          <w:color w:val="1A1A2E"/>
-          <w:sz w:val="20"/>
-          <w:szCs w:val="20"/>
-        </w:rPr>
-        <w:t xml:space="preserve">Pole Position: +1 punto (per classe)</w:t>
       </w:r>
     </w:p>
     <w:p>

</xml_diff>

<commit_message>
UE144: prove libere ridotte da 30' a 10'
Aggiornato ovunque compaiva la durata: pagina live (UE144.jsx), le tre
copie del regolamento (public/, public/docs/, docs/ue144/ — docx +
PDF rigenerato da LibreOffice, validato con lo script XSD), e i testi
di annuncio già pubblicati in outputs/ (discord_info, briefing,
social) per coerenza con chi li rilegge in futuro.

npm run build/lint verdi.
</commit_message>
<xml_diff>
--- a/docs/ue144/ue144_regolamento.docx
+++ b/docs/ue144/ue144_regolamento.docx
@@ -487,7 +487,7 @@
           <w:sz w:val="20"/>
           <w:szCs w:val="20"/>
         </w:rPr>
-        <w:t xml:space="preserve">Practice: 30 minuti — sessione aperta (open lobby), dedicata all'analisi telemetrica e al setup</w:t>
+        <w:t xml:space="preserve">Practice: 10 minuti — sessione aperta (open lobby), dedicata all'analisi telemetrica e al setup</w:t>
       </w:r>
     </w:p>
     <w:p>
@@ -1388,7 +1388,7 @@
           <w:sz w:val="22"/>
           <w:szCs w:val="22"/>
         </w:rPr>
-        <w:t xml:space="preserve">4.1 Practice (30 min — open)</w:t>
+        <w:t xml:space="preserve">4.1 Practice (10 min — open)</w:t>
       </w:r>
     </w:p>
     <w:p>

</xml_diff>

<commit_message>
UE144: fix orario server (21:00 reale) vs in-game per round, regola gomme/termocoperte, temperature di scenario per round
</commit_message>
<xml_diff>
--- a/docs/ue144/ue144_regolamento.docx
+++ b/docs/ue144/ue144_regolamento.docx
@@ -1009,6 +1009,117 @@
     </w:p>
     <w:p>
       <w:pPr>
+        <w:pStyle w:val="Heading2"/>
+        <w:spacing w:after="80" w:before="240"/>
+      </w:pPr>
+      <w:r>
+        <w:rPr>
+          <w:rFonts w:ascii="Calibri" w:cs="Calibri" w:eastAsia="Calibri" w:hAnsi="Calibri"/>
+          <w:b/>
+          <w:bCs/>
+          <w:color w:val="F5A623"/>
+          <w:sz w:val="22"/>
+          <w:szCs w:val="22"/>
+        </w:rPr>
+        <w:t xml:space="preserve">2.3 Gomme</w:t>
+      </w:r>
+    </w:p>
+    <w:p>
+      <w:pPr>
+        <w:spacing w:after="80" w:before="80"/>
+      </w:pPr>
+      <w:r>
+        <w:rPr>
+          <w:rFonts w:ascii="Calibri" w:cs="Calibri" w:eastAsia="Calibri" w:hAnsi="Calibri"/>
+          <w:b w:val="false"/>
+          <w:bCs w:val="false"/>
+          <w:color w:val="1A1A2E"/>
+          <w:sz w:val="20"/>
+          <w:szCs w:val="20"/>
+        </w:rPr>
+        <w:t xml:space="preserve">Termocoperte attive per tutte le classi. A disposizione di ogni pilota: 14 pneumatici per round (practice + qualifica + gara), gestiti in totale autonomia — nessun compound imposto oltre a quanto previsto dal BoP LMU della classe.</w:t>
+      </w:r>
+    </w:p>
+    <w:p>
+      <w:pPr>
+        <w:spacing w:after="60" w:before="60"/>
+        <w:ind w:left="504"/>
+      </w:pPr>
+      <w:r>
+        <w:rPr>
+          <w:rFonts w:ascii="Calibri" w:cs="Calibri" w:eastAsia="Calibri" w:hAnsi="Calibri"/>
+          <w:b/>
+          <w:bCs/>
+          <w:color w:val="00D9FF"/>
+          <w:sz w:val="20"/>
+          <w:szCs w:val="20"/>
+        </w:rPr>
+        <w:t xml:space="preserve">▸  </w:t>
+      </w:r>
+      <w:r>
+        <w:rPr>
+          <w:rFonts w:ascii="Calibri" w:cs="Calibri" w:eastAsia="Calibri" w:hAnsi="Calibri"/>
+          <w:color w:val="1A1A2E"/>
+          <w:sz w:val="20"/>
+          <w:szCs w:val="20"/>
+        </w:rPr>
+        <w:t xml:space="preserve">Termocoperte: attive, nessuna limitazione di utilizzo</w:t>
+      </w:r>
+    </w:p>
+    <w:p>
+      <w:pPr>
+        <w:spacing w:after="60" w:before="60"/>
+        <w:ind w:left="504"/>
+      </w:pPr>
+      <w:r>
+        <w:rPr>
+          <w:rFonts w:ascii="Calibri" w:cs="Calibri" w:eastAsia="Calibri" w:hAnsi="Calibri"/>
+          <w:b/>
+          <w:bCs/>
+          <w:color w:val="00D9FF"/>
+          <w:sz w:val="20"/>
+          <w:szCs w:val="20"/>
+        </w:rPr>
+        <w:t xml:space="preserve">▸  </w:t>
+      </w:r>
+      <w:r>
+        <w:rPr>
+          <w:rFonts w:ascii="Calibri" w:cs="Calibri" w:eastAsia="Calibri" w:hAnsi="Calibri"/>
+          <w:color w:val="1A1A2E"/>
+          <w:sz w:val="20"/>
+          <w:szCs w:val="20"/>
+        </w:rPr>
+        <w:t xml:space="preserve">Set gomme disponibili: 14 per pilota, per round</w:t>
+      </w:r>
+    </w:p>
+    <w:p>
+      <w:pPr>
+        <w:spacing w:after="60" w:before="60"/>
+        <w:ind w:left="504"/>
+      </w:pPr>
+      <w:r>
+        <w:rPr>
+          <w:rFonts w:ascii="Calibri" w:cs="Calibri" w:eastAsia="Calibri" w:hAnsi="Calibri"/>
+          <w:b/>
+          <w:bCs/>
+          <w:color w:val="00D9FF"/>
+          <w:sz w:val="20"/>
+          <w:szCs w:val="20"/>
+        </w:rPr>
+        <w:t xml:space="preserve">▸  </w:t>
+      </w:r>
+      <w:r>
+        <w:rPr>
+          <w:rFonts w:ascii="Calibri" w:cs="Calibri" w:eastAsia="Calibri" w:hAnsi="Calibri"/>
+          <w:color w:val="1A1A2E"/>
+          <w:sz w:val="20"/>
+          <w:szCs w:val="20"/>
+        </w:rPr>
+        <w:t xml:space="preserve">Compound: libera scelta tra quelli disponibili per la vettura in LMU</w:t>
+      </w:r>
+    </w:p>
+    <w:p>
+      <w:pPr>
         <w:pStyle w:val="Heading1"/>
         <w:pBdr>
           <w:bottom w:val="single" w:color="00D9FF" w:sz="4" w:space="4"/>
@@ -3880,6 +3991,22 @@
     </w:p>
     <w:p>
       <w:pPr>
+        <w:spacing w:after="80" w:before="80"/>
+      </w:pPr>
+      <w:r>
+        <w:rPr>
+          <w:rFonts w:ascii="Calibri" w:cs="Calibri" w:eastAsia="Calibri" w:hAnsi="Calibri"/>
+          <w:b/>
+          <w:bCs/>
+          <w:color w:val="1A1A2E"/>
+          <w:sz w:val="20"/>
+          <w:szCs w:val="20"/>
+        </w:rPr>
+        <w:t xml:space="preserve">Apertura server: 21:00 (ora reale, per tutti i round). L’orario “Ora in-game” in tabella è l’orologio virtuale del circuito all’avvio della gara, non l’orario reale di connessione — vedi anche la tabella temperature subito dopo il calendario.</w:t>
+      </w:r>
+    </w:p>
+    <w:p>
+      <w:pPr>
         <w:spacing w:after="0" w:before="80"/>
       </w:pPr>
     </w:p>
@@ -4018,7 +4145,7 @@
                 <w:sz w:val="18"/>
                 <w:szCs w:val="18"/>
               </w:rPr>
-              <w:t xml:space="preserve">Ora</w:t>
+              <w:t xml:space="preserve">Ora in-game</w:t>
             </w:r>
           </w:p>
         </w:tc>
@@ -4938,6 +5065,672 @@
     <w:p>
       <w:r>
         <w:br w:type="page"/>
+      </w:r>
+    </w:p>
+    <w:p>
+      <w:pPr>
+        <w:spacing w:after="80" w:before="160"/>
+      </w:pPr>
+      <w:r>
+        <w:rPr>
+          <w:rFonts w:ascii="Calibri" w:cs="Calibri" w:eastAsia="Calibri" w:hAnsi="Calibri"/>
+          <w:b/>
+          <w:bCs/>
+          <w:color w:val="1A1A2E"/>
+          <w:sz w:val="20"/>
+          <w:szCs w:val="20"/>
+        </w:rPr>
+        <w:t xml:space="preserve">Temperature di scenario (aria e asfalto, inizio → fine gara)</w:t>
+      </w:r>
+    </w:p>
+    <w:tbl>
+      <w:tblPr>
+        <w:tblW w:type="dxa" w:w="9072"/>
+        <w:tblBorders>
+          <w:top w:val="single" w:color="auto" w:sz="4"/>
+          <w:left w:val="single" w:color="auto" w:sz="4"/>
+          <w:bottom w:val="single" w:color="auto" w:sz="4"/>
+          <w:right w:val="single" w:color="auto" w:sz="4"/>
+          <w:insideH w:val="single" w:color="auto" w:sz="4"/>
+          <w:insideV w:val="single" w:color="auto" w:sz="4"/>
+        </w:tblBorders>
+      </w:tblPr>
+      <w:tblGrid>
+        <w:gridCol w:w="2800"/>
+        <w:gridCol w:w="2800"/>
+        <w:gridCol w:w="3472"/>
+      </w:tblGrid>
+      <w:tr>
+        <w:trPr>
+          <w:tblHeader/>
+        </w:trPr>
+        <w:tc>
+          <w:tcPr>
+            <w:tcW w:type="dxa" w:w="2800"/>
+            <w:shd w:fill="0A0E1A" w:val="clear"/>
+            <w:tcMar>
+              <w:top w:type="dxa" w:w="80"/>
+              <w:left w:type="dxa" w:w="120"/>
+              <w:bottom w:type="dxa" w:w="80"/>
+              <w:right w:type="dxa" w:w="120"/>
+            </w:tcMar>
+            <w:vAlign w:val="center"/>
+          </w:tcPr>
+          <w:p>
+            <w:pPr>
+              <w:jc w:val="left"/>
+            </w:pPr>
+            <w:r>
+              <w:rPr>
+                <w:rFonts w:ascii="Calibri" w:cs="Calibri" w:eastAsia="Calibri" w:hAnsi="Calibri"/>
+                <w:b/>
+                <w:bCs/>
+                <w:color w:val="FFFFFF"/>
+                <w:sz w:val="18"/>
+                <w:szCs w:val="18"/>
+              </w:rPr>
+              <w:t xml:space="preserve">ROUND</w:t>
+            </w:r>
+          </w:p>
+        </w:tc>
+        <w:tc>
+          <w:tcPr>
+            <w:tcW w:type="dxa" w:w="2800"/>
+            <w:shd w:fill="0A0E1A" w:val="clear"/>
+            <w:tcMar>
+              <w:top w:type="dxa" w:w="80"/>
+              <w:left w:type="dxa" w:w="120"/>
+              <w:bottom w:type="dxa" w:w="80"/>
+              <w:right w:type="dxa" w:w="120"/>
+            </w:tcMar>
+            <w:vAlign w:val="center"/>
+          </w:tcPr>
+          <w:p>
+            <w:pPr>
+              <w:jc w:val="left"/>
+            </w:pPr>
+            <w:r>
+              <w:rPr>
+                <w:rFonts w:ascii="Calibri" w:cs="Calibri" w:eastAsia="Calibri" w:hAnsi="Calibri"/>
+                <w:b/>
+                <w:bCs/>
+                <w:color w:val="FFFFFF"/>
+                <w:sz w:val="18"/>
+                <w:szCs w:val="18"/>
+              </w:rPr>
+              <w:t xml:space="preserve">ARIA (inizio → fine)</w:t>
+            </w:r>
+          </w:p>
+        </w:tc>
+        <w:tc>
+          <w:tcPr>
+            <w:tcW w:type="dxa" w:w="3472"/>
+            <w:shd w:fill="0A0E1A" w:val="clear"/>
+            <w:tcMar>
+              <w:top w:type="dxa" w:w="80"/>
+              <w:left w:type="dxa" w:w="120"/>
+              <w:bottom w:type="dxa" w:w="80"/>
+              <w:right w:type="dxa" w:w="120"/>
+            </w:tcMar>
+            <w:vAlign w:val="center"/>
+          </w:tcPr>
+          <w:p>
+            <w:pPr>
+              <w:jc w:val="left"/>
+            </w:pPr>
+            <w:r>
+              <w:rPr>
+                <w:rFonts w:ascii="Calibri" w:cs="Calibri" w:eastAsia="Calibri" w:hAnsi="Calibri"/>
+                <w:b/>
+                <w:bCs/>
+                <w:color w:val="FFFFFF"/>
+                <w:sz w:val="18"/>
+                <w:szCs w:val="18"/>
+              </w:rPr>
+              <w:t xml:space="preserve">ASFALTO (inizio → fine)</w:t>
+            </w:r>
+          </w:p>
+        </w:tc>
+      </w:tr>
+      <w:tr>
+        <w:tc>
+          <w:tcPr>
+            <w:tcW w:type="dxa" w:w="2800"/>
+            <w:shd w:fill="E8E8E8" w:val="clear"/>
+            <w:tcMar>
+              <w:top w:type="dxa" w:w="80"/>
+              <w:left w:type="dxa" w:w="120"/>
+              <w:bottom w:type="dxa" w:w="80"/>
+              <w:right w:type="dxa" w:w="120"/>
+            </w:tcMar>
+            <w:vAlign w:val="center"/>
+          </w:tcPr>
+          <w:p>
+            <w:pPr>
+              <w:jc w:val="left"/>
+            </w:pPr>
+            <w:r>
+              <w:rPr>
+                <w:rFonts w:ascii="Calibri" w:cs="Calibri" w:eastAsia="Calibri" w:hAnsi="Calibri"/>
+                <w:b w:val="false"/>
+                <w:bCs w:val="false"/>
+                <w:color w:val="1A1A2E"/>
+                <w:sz w:val="18"/>
+                <w:szCs w:val="18"/>
+              </w:rPr>
+              <w:t xml:space="preserve">R1 — Sebring</w:t>
+            </w:r>
+          </w:p>
+        </w:tc>
+        <w:tc>
+          <w:tcPr>
+            <w:tcW w:type="dxa" w:w="2800"/>
+            <w:tcMar>
+              <w:top w:type="dxa" w:w="80"/>
+              <w:left w:type="dxa" w:w="120"/>
+              <w:bottom w:type="dxa" w:w="80"/>
+              <w:right w:type="dxa" w:w="120"/>
+            </w:tcMar>
+            <w:vAlign w:val="center"/>
+          </w:tcPr>
+          <w:p>
+            <w:pPr>
+              <w:jc w:val="left"/>
+            </w:pPr>
+            <w:r>
+              <w:rPr>
+                <w:rFonts w:ascii="Calibri" w:cs="Calibri" w:eastAsia="Calibri" w:hAnsi="Calibri"/>
+                <w:b w:val="false"/>
+                <w:bCs w:val="false"/>
+                <w:color w:val="1A1A2E"/>
+                <w:sz w:val="18"/>
+                <w:szCs w:val="18"/>
+              </w:rPr>
+              <w:t xml:space="preserve">31°C → 22°C</w:t>
+            </w:r>
+          </w:p>
+        </w:tc>
+        <w:tc>
+          <w:tcPr>
+            <w:tcW w:type="dxa" w:w="3472"/>
+            <w:tcMar>
+              <w:top w:type="dxa" w:w="80"/>
+              <w:left w:type="dxa" w:w="120"/>
+              <w:bottom w:type="dxa" w:w="80"/>
+              <w:right w:type="dxa" w:w="120"/>
+            </w:tcMar>
+            <w:vAlign w:val="center"/>
+          </w:tcPr>
+          <w:p>
+            <w:pPr>
+              <w:jc w:val="left"/>
+            </w:pPr>
+            <w:r>
+              <w:rPr>
+                <w:rFonts w:ascii="Calibri" w:cs="Calibri" w:eastAsia="Calibri" w:hAnsi="Calibri"/>
+                <w:b w:val="false"/>
+                <w:bCs w:val="false"/>
+                <w:color w:val="555555"/>
+                <w:sz w:val="17"/>
+                <w:szCs w:val="17"/>
+              </w:rPr>
+              <w:t xml:space="preserve">42°C → 24°C</w:t>
+            </w:r>
+          </w:p>
+        </w:tc>
+      </w:tr>
+      <w:tr>
+        <w:tc>
+          <w:tcPr>
+            <w:tcW w:type="dxa" w:w="2800"/>
+            <w:tcMar>
+              <w:top w:type="dxa" w:w="80"/>
+              <w:left w:type="dxa" w:w="120"/>
+              <w:bottom w:type="dxa" w:w="80"/>
+              <w:right w:type="dxa" w:w="120"/>
+            </w:tcMar>
+            <w:vAlign w:val="center"/>
+          </w:tcPr>
+          <w:p>
+            <w:pPr>
+              <w:jc w:val="left"/>
+            </w:pPr>
+            <w:r>
+              <w:rPr>
+                <w:rFonts w:ascii="Calibri" w:cs="Calibri" w:eastAsia="Calibri" w:hAnsi="Calibri"/>
+                <w:b w:val="false"/>
+                <w:bCs w:val="false"/>
+                <w:color w:val="1A1A2E"/>
+                <w:sz w:val="18"/>
+                <w:szCs w:val="18"/>
+              </w:rPr>
+              <w:t xml:space="preserve">R2 — Imola</w:t>
+            </w:r>
+          </w:p>
+        </w:tc>
+        <w:tc>
+          <w:tcPr>
+            <w:tcW w:type="dxa" w:w="2800"/>
+            <w:tcMar>
+              <w:top w:type="dxa" w:w="80"/>
+              <w:left w:type="dxa" w:w="120"/>
+              <w:bottom w:type="dxa" w:w="80"/>
+              <w:right w:type="dxa" w:w="120"/>
+            </w:tcMar>
+            <w:vAlign w:val="center"/>
+          </w:tcPr>
+          <w:p>
+            <w:pPr>
+              <w:jc w:val="left"/>
+            </w:pPr>
+            <w:r>
+              <w:rPr>
+                <w:rFonts w:ascii="Calibri" w:cs="Calibri" w:eastAsia="Calibri" w:hAnsi="Calibri"/>
+                <w:b w:val="false"/>
+                <w:bCs w:val="false"/>
+                <w:color w:val="1A1A2E"/>
+                <w:sz w:val="18"/>
+                <w:szCs w:val="18"/>
+              </w:rPr>
+              <w:t xml:space="preserve">17°C → 23°C</w:t>
+            </w:r>
+          </w:p>
+        </w:tc>
+        <w:tc>
+          <w:tcPr>
+            <w:tcW w:type="dxa" w:w="3472"/>
+            <w:tcMar>
+              <w:top w:type="dxa" w:w="80"/>
+              <w:left w:type="dxa" w:w="120"/>
+              <w:bottom w:type="dxa" w:w="80"/>
+              <w:right w:type="dxa" w:w="120"/>
+            </w:tcMar>
+            <w:vAlign w:val="center"/>
+          </w:tcPr>
+          <w:p>
+            <w:pPr>
+              <w:jc w:val="left"/>
+            </w:pPr>
+            <w:r>
+              <w:rPr>
+                <w:rFonts w:ascii="Calibri" w:cs="Calibri" w:eastAsia="Calibri" w:hAnsi="Calibri"/>
+                <w:b w:val="false"/>
+                <w:bCs w:val="false"/>
+                <w:color w:val="555555"/>
+                <w:sz w:val="17"/>
+                <w:szCs w:val="17"/>
+              </w:rPr>
+              <w:t xml:space="preserve">22°C → 28°C</w:t>
+            </w:r>
+          </w:p>
+        </w:tc>
+      </w:tr>
+      <w:tr>
+        <w:tc>
+          <w:tcPr>
+            <w:tcW w:type="dxa" w:w="2800"/>
+            <w:shd w:fill="E8E8E8" w:val="clear"/>
+            <w:tcMar>
+              <w:top w:type="dxa" w:w="80"/>
+              <w:left w:type="dxa" w:w="120"/>
+              <w:bottom w:type="dxa" w:w="80"/>
+              <w:right w:type="dxa" w:w="120"/>
+            </w:tcMar>
+            <w:vAlign w:val="center"/>
+          </w:tcPr>
+          <w:p>
+            <w:pPr>
+              <w:jc w:val="left"/>
+            </w:pPr>
+            <w:r>
+              <w:rPr>
+                <w:rFonts w:ascii="Calibri" w:cs="Calibri" w:eastAsia="Calibri" w:hAnsi="Calibri"/>
+                <w:b w:val="false"/>
+                <w:bCs w:val="false"/>
+                <w:color w:val="1A1A2E"/>
+                <w:sz w:val="18"/>
+                <w:szCs w:val="18"/>
+              </w:rPr>
+              <w:t xml:space="preserve">R3 — Spa-Francorchamps</w:t>
+            </w:r>
+          </w:p>
+        </w:tc>
+        <w:tc>
+          <w:tcPr>
+            <w:tcW w:type="dxa" w:w="2800"/>
+            <w:tcMar>
+              <w:top w:type="dxa" w:w="80"/>
+              <w:left w:type="dxa" w:w="120"/>
+              <w:bottom w:type="dxa" w:w="80"/>
+              <w:right w:type="dxa" w:w="120"/>
+            </w:tcMar>
+            <w:vAlign w:val="center"/>
+          </w:tcPr>
+          <w:p>
+            <w:pPr>
+              <w:jc w:val="left"/>
+            </w:pPr>
+            <w:r>
+              <w:rPr>
+                <w:rFonts w:ascii="Calibri" w:cs="Calibri" w:eastAsia="Calibri" w:hAnsi="Calibri"/>
+                <w:b w:val="false"/>
+                <w:bCs w:val="false"/>
+                <w:color w:val="1A1A2E"/>
+                <w:sz w:val="18"/>
+                <w:szCs w:val="18"/>
+              </w:rPr>
+              <w:t xml:space="preserve">12°C → 6°C → 10°C</w:t>
+            </w:r>
+          </w:p>
+        </w:tc>
+        <w:tc>
+          <w:tcPr>
+            <w:tcW w:type="dxa" w:w="3472"/>
+            <w:tcMar>
+              <w:top w:type="dxa" w:w="80"/>
+              <w:left w:type="dxa" w:w="120"/>
+              <w:bottom w:type="dxa" w:w="80"/>
+              <w:right w:type="dxa" w:w="120"/>
+            </w:tcMar>
+            <w:vAlign w:val="center"/>
+          </w:tcPr>
+          <w:p>
+            <w:pPr>
+              <w:jc w:val="left"/>
+            </w:pPr>
+            <w:r>
+              <w:rPr>
+                <w:rFonts w:ascii="Calibri" w:cs="Calibri" w:eastAsia="Calibri" w:hAnsi="Calibri"/>
+                <w:b w:val="false"/>
+                <w:bCs w:val="false"/>
+                <w:color w:val="555555"/>
+                <w:sz w:val="17"/>
+                <w:szCs w:val="17"/>
+              </w:rPr>
+              <w:t xml:space="preserve">18°C → 14°C → 17°C</w:t>
+            </w:r>
+          </w:p>
+        </w:tc>
+      </w:tr>
+      <w:tr>
+        <w:tc>
+          <w:tcPr>
+            <w:tcW w:type="dxa" w:w="2800"/>
+            <w:tcMar>
+              <w:top w:type="dxa" w:w="80"/>
+              <w:left w:type="dxa" w:w="120"/>
+              <w:bottom w:type="dxa" w:w="80"/>
+              <w:right w:type="dxa" w:w="120"/>
+            </w:tcMar>
+            <w:vAlign w:val="center"/>
+          </w:tcPr>
+          <w:p>
+            <w:pPr>
+              <w:jc w:val="left"/>
+            </w:pPr>
+            <w:r>
+              <w:rPr>
+                <w:rFonts w:ascii="Calibri" w:cs="Calibri" w:eastAsia="Calibri" w:hAnsi="Calibri"/>
+                <w:b w:val="false"/>
+                <w:bCs w:val="false"/>
+                <w:color w:val="1A1A2E"/>
+                <w:sz w:val="18"/>
+                <w:szCs w:val="18"/>
+              </w:rPr>
+              <w:t xml:space="preserve">R4 — Fuji Speedway</w:t>
+            </w:r>
+          </w:p>
+        </w:tc>
+        <w:tc>
+          <w:tcPr>
+            <w:tcW w:type="dxa" w:w="2800"/>
+            <w:tcMar>
+              <w:top w:type="dxa" w:w="80"/>
+              <w:left w:type="dxa" w:w="120"/>
+              <w:bottom w:type="dxa" w:w="80"/>
+              <w:right w:type="dxa" w:w="120"/>
+            </w:tcMar>
+            <w:vAlign w:val="center"/>
+          </w:tcPr>
+          <w:p>
+            <w:pPr>
+              <w:jc w:val="left"/>
+            </w:pPr>
+            <w:r>
+              <w:rPr>
+                <w:rFonts w:ascii="Calibri" w:cs="Calibri" w:eastAsia="Calibri" w:hAnsi="Calibri"/>
+                <w:b w:val="false"/>
+                <w:bCs w:val="false"/>
+                <w:color w:val="1A1A2E"/>
+                <w:sz w:val="18"/>
+                <w:szCs w:val="18"/>
+              </w:rPr>
+              <w:t xml:space="preserve">17°C → 12°C → 10°C</w:t>
+            </w:r>
+          </w:p>
+        </w:tc>
+        <w:tc>
+          <w:tcPr>
+            <w:tcW w:type="dxa" w:w="3472"/>
+            <w:tcMar>
+              <w:top w:type="dxa" w:w="80"/>
+              <w:left w:type="dxa" w:w="120"/>
+              <w:bottom w:type="dxa" w:w="80"/>
+              <w:right w:type="dxa" w:w="120"/>
+            </w:tcMar>
+            <w:vAlign w:val="center"/>
+          </w:tcPr>
+          <w:p>
+            <w:pPr>
+              <w:jc w:val="left"/>
+            </w:pPr>
+            <w:r>
+              <w:rPr>
+                <w:rFonts w:ascii="Calibri" w:cs="Calibri" w:eastAsia="Calibri" w:hAnsi="Calibri"/>
+                <w:b w:val="false"/>
+                <w:bCs w:val="false"/>
+                <w:color w:val="555555"/>
+                <w:sz w:val="17"/>
+                <w:szCs w:val="17"/>
+              </w:rPr>
+              <w:t xml:space="preserve">20°C → 16°C → 15°C</w:t>
+            </w:r>
+          </w:p>
+        </w:tc>
+      </w:tr>
+      <w:tr>
+        <w:tc>
+          <w:tcPr>
+            <w:tcW w:type="dxa" w:w="2800"/>
+            <w:shd w:fill="E8E8E8" w:val="clear"/>
+            <w:tcMar>
+              <w:top w:type="dxa" w:w="80"/>
+              <w:left w:type="dxa" w:w="120"/>
+              <w:bottom w:type="dxa" w:w="80"/>
+              <w:right w:type="dxa" w:w="120"/>
+            </w:tcMar>
+            <w:vAlign w:val="center"/>
+          </w:tcPr>
+          <w:p>
+            <w:pPr>
+              <w:jc w:val="left"/>
+            </w:pPr>
+            <w:r>
+              <w:rPr>
+                <w:rFonts w:ascii="Calibri" w:cs="Calibri" w:eastAsia="Calibri" w:hAnsi="Calibri"/>
+                <w:b w:val="false"/>
+                <w:bCs w:val="false"/>
+                <w:color w:val="1A1A2E"/>
+                <w:sz w:val="18"/>
+                <w:szCs w:val="18"/>
+              </w:rPr>
+              <w:t xml:space="preserve">R5 — Monza</w:t>
+            </w:r>
+          </w:p>
+        </w:tc>
+        <w:tc>
+          <w:tcPr>
+            <w:tcW w:type="dxa" w:w="2800"/>
+            <w:tcMar>
+              <w:top w:type="dxa" w:w="80"/>
+              <w:left w:type="dxa" w:w="120"/>
+              <w:bottom w:type="dxa" w:w="80"/>
+              <w:right w:type="dxa" w:w="120"/>
+            </w:tcMar>
+            <w:vAlign w:val="center"/>
+          </w:tcPr>
+          <w:p>
+            <w:pPr>
+              <w:jc w:val="left"/>
+            </w:pPr>
+            <w:r>
+              <w:rPr>
+                <w:rFonts w:ascii="Calibri" w:cs="Calibri" w:eastAsia="Calibri" w:hAnsi="Calibri"/>
+                <w:b w:val="false"/>
+                <w:bCs w:val="false"/>
+                <w:color w:val="1A1A2E"/>
+                <w:sz w:val="18"/>
+                <w:szCs w:val="18"/>
+              </w:rPr>
+              <w:t xml:space="preserve">15°C → 11°C</w:t>
+            </w:r>
+          </w:p>
+        </w:tc>
+        <w:tc>
+          <w:tcPr>
+            <w:tcW w:type="dxa" w:w="3472"/>
+            <w:tcMar>
+              <w:top w:type="dxa" w:w="80"/>
+              <w:left w:type="dxa" w:w="120"/>
+              <w:bottom w:type="dxa" w:w="80"/>
+              <w:right w:type="dxa" w:w="120"/>
+            </w:tcMar>
+            <w:vAlign w:val="center"/>
+          </w:tcPr>
+          <w:p>
+            <w:pPr>
+              <w:jc w:val="left"/>
+            </w:pPr>
+            <w:r>
+              <w:rPr>
+                <w:rFonts w:ascii="Calibri" w:cs="Calibri" w:eastAsia="Calibri" w:hAnsi="Calibri"/>
+                <w:b w:val="false"/>
+                <w:bCs w:val="false"/>
+                <w:color w:val="555555"/>
+                <w:sz w:val="17"/>
+                <w:szCs w:val="17"/>
+              </w:rPr>
+              <w:t xml:space="preserve">22°C → 16°C</w:t>
+            </w:r>
+          </w:p>
+        </w:tc>
+      </w:tr>
+      <w:tr>
+        <w:tc>
+          <w:tcPr>
+            <w:tcW w:type="dxa" w:w="2800"/>
+            <w:tcMar>
+              <w:top w:type="dxa" w:w="80"/>
+              <w:left w:type="dxa" w:w="120"/>
+              <w:bottom w:type="dxa" w:w="80"/>
+              <w:right w:type="dxa" w:w="120"/>
+            </w:tcMar>
+            <w:vAlign w:val="center"/>
+          </w:tcPr>
+          <w:p>
+            <w:pPr>
+              <w:jc w:val="left"/>
+            </w:pPr>
+            <w:r>
+              <w:rPr>
+                <w:rFonts w:ascii="Calibri" w:cs="Calibri" w:eastAsia="Calibri" w:hAnsi="Calibri"/>
+                <w:b w:val="false"/>
+                <w:bCs w:val="false"/>
+                <w:color w:val="1A1A2E"/>
+                <w:sz w:val="18"/>
+                <w:szCs w:val="18"/>
+              </w:rPr>
+              <w:t xml:space="preserve">R6 — Le Mans</w:t>
+            </w:r>
+          </w:p>
+        </w:tc>
+        <w:tc>
+          <w:tcPr>
+            <w:tcW w:type="dxa" w:w="2800"/>
+            <w:tcMar>
+              <w:top w:type="dxa" w:w="80"/>
+              <w:left w:type="dxa" w:w="120"/>
+              <w:bottom w:type="dxa" w:w="80"/>
+              <w:right w:type="dxa" w:w="120"/>
+            </w:tcMar>
+            <w:vAlign w:val="center"/>
+          </w:tcPr>
+          <w:p>
+            <w:pPr>
+              <w:jc w:val="left"/>
+            </w:pPr>
+            <w:r>
+              <w:rPr>
+                <w:rFonts w:ascii="Calibri" w:cs="Calibri" w:eastAsia="Calibri" w:hAnsi="Calibri"/>
+                <w:b w:val="false"/>
+                <w:bCs w:val="false"/>
+                <w:color w:val="1A1A2E"/>
+                <w:sz w:val="18"/>
+                <w:szCs w:val="18"/>
+              </w:rPr>
+              <w:t xml:space="preserve">8°C → 3°C → 2°C</w:t>
+            </w:r>
+          </w:p>
+        </w:tc>
+        <w:tc>
+          <w:tcPr>
+            <w:tcW w:type="dxa" w:w="3472"/>
+            <w:tcMar>
+              <w:top w:type="dxa" w:w="80"/>
+              <w:left w:type="dxa" w:w="120"/>
+              <w:bottom w:type="dxa" w:w="80"/>
+              <w:right w:type="dxa" w:w="120"/>
+            </w:tcMar>
+            <w:vAlign w:val="center"/>
+          </w:tcPr>
+          <w:p>
+            <w:pPr>
+              <w:jc w:val="left"/>
+            </w:pPr>
+            <w:r>
+              <w:rPr>
+                <w:rFonts w:ascii="Calibri" w:cs="Calibri" w:eastAsia="Calibri" w:hAnsi="Calibri"/>
+                <w:b w:val="false"/>
+                <w:bCs w:val="false"/>
+                <w:color w:val="555555"/>
+                <w:sz w:val="17"/>
+                <w:szCs w:val="17"/>
+              </w:rPr>
+              <w:t xml:space="preserve">14°C → 10°C → 8°C</w:t>
+            </w:r>
+          </w:p>
+        </w:tc>
+      </w:tr>
+    </w:tbl>
+    <w:p>
+      <w:pPr>
+        <w:pBdr>
+          <w:left w:val="single" w:color="F5A623" w:sz="12" w:space="4"/>
+        </w:pBdr>
+        <w:shd w:fill="FFF8EC" w:val="clear"/>
+        <w:spacing w:after="80" w:before="80"/>
+        <w:ind w:left="288" w:right="288"/>
+      </w:pPr>
+      <w:r>
+        <w:rPr>
+          <w:rFonts w:ascii="Calibri" w:cs="Calibri" w:eastAsia="Calibri" w:hAnsi="Calibri"/>
+          <w:i/>
+          <w:iCs/>
+          <w:color w:val="7A4A00"/>
+          <w:sz w:val="18"/>
+          <w:szCs w:val="18"/>
+        </w:rPr>
+        <w:t xml:space="preserve">⚠  Valori di scenario impostati lato server, non un meteo live — calibrati per sede/periodo e corretti verso l’alto su asfalto/pista per garantire grip e trazione realistici.</w:t>
       </w:r>
     </w:p>
     <w:p>

</xml_diff>